<commit_message>
add contract logo + robots.txt + sitemap.xml
</commit_message>
<xml_diff>
--- a/private_files/عرض سعر نظام حجز العيادات.docx
+++ b/private_files/عرض سعر نظام حجز العيادات.docx
@@ -5,7 +5,6 @@
     <w:p>
       <w:pPr>
         <w:spacing w:before="120" w:after="120"/>
-        <w:jc w:val="center"/>
         <w:rPr>
           <w:sz w:val="24"/>
           <w:szCs w:val="24"/>
@@ -18,18 +17,18 @@
           <w:szCs w:val="24"/>
         </w:rPr>
         <w:drawing>
-          <wp:anchor distT="0" distB="0" distL="114300" distR="114300" simplePos="0" relativeHeight="251658240" behindDoc="0" locked="0" layoutInCell="1" allowOverlap="1" wp14:anchorId="5E53B88E" wp14:editId="4CDC0976">
+          <wp:anchor distT="0" distB="0" distL="114300" distR="114300" simplePos="0" relativeHeight="251658240" behindDoc="0" locked="0" layoutInCell="1" allowOverlap="1" wp14:anchorId="66F56C70" wp14:editId="704DEEDC">
             <wp:simplePos x="0" y="0"/>
             <wp:positionH relativeFrom="page">
-              <wp:posOffset>0</wp:posOffset>
+              <wp:posOffset>1237615</wp:posOffset>
             </wp:positionH>
             <wp:positionV relativeFrom="page">
-              <wp:posOffset>0</wp:posOffset>
+              <wp:posOffset>628650</wp:posOffset>
             </wp:positionV>
-            <wp:extent cx="7553325" cy="1304925"/>
-            <wp:effectExtent l="19050" t="0" r="9525" b="428625"/>
+            <wp:extent cx="5381625" cy="1343025"/>
+            <wp:effectExtent l="19050" t="0" r="9525" b="447675"/>
             <wp:wrapTopAndBottom/>
-            <wp:docPr id="1" name="Drawing 0" descr="10d244f02-086f-439a-b266-5d295381f2e8.png"/>
+            <wp:docPr id="1" name="Drawing 0"/>
             <wp:cNvGraphicFramePr>
               <a:graphicFrameLocks xmlns:a="http://schemas.openxmlformats.org/drawingml/2006/main" noChangeAspect="1"/>
             </wp:cNvGraphicFramePr>
@@ -43,7 +42,13 @@
                     </pic:cNvPicPr>
                   </pic:nvPicPr>
                   <pic:blipFill>
-                    <a:blip r:embed="rId9"/>
+                    <a:blip r:embed="rId9">
+                      <a:extLst>
+                        <a:ext uri="{28A0092B-C50C-407E-A947-70E740481C1C}">
+                          <a14:useLocalDpi xmlns:a14="http://schemas.microsoft.com/office/drawing/2010/main" val="0"/>
+                        </a:ext>
+                      </a:extLst>
+                    </a:blip>
                     <a:stretch>
                       <a:fillRect/>
                     </a:stretch>
@@ -51,7 +56,7 @@
                   <pic:spPr>
                     <a:xfrm>
                       <a:off x="0" y="0"/>
-                      <a:ext cx="7553325" cy="1304925"/>
+                      <a:ext cx="5381625" cy="1343025"/>
                     </a:xfrm>
                     <a:prstGeom prst="roundRect">
                       <a:avLst>
@@ -210,7 +215,7 @@
     <w:p>
       <w:pPr>
         <w:spacing w:before="120" w:after="120" w:line="336" w:lineRule="auto"/>
-        <w:jc w:val="right"/>
+        <w:jc w:val="center"/>
         <w:rPr>
           <w:rStyle w:val="Strong"/>
           <w:sz w:val="24"/>
@@ -236,8 +241,6 @@
           <w:szCs w:val="24"/>
         </w:rPr>
       </w:pPr>
-      <w:bookmarkStart w:id="0" w:name="_GoBack"/>
-      <w:bookmarkEnd w:id="0"/>
       <w:r>
         <w:rPr>
           <w:rStyle w:val="Strong"/>
@@ -250,11 +253,13 @@
     <w:p>
       <w:pPr>
         <w:spacing w:before="120" w:after="120" w:line="336" w:lineRule="auto"/>
-        <w:jc w:val="right"/>
-        <w:rPr>
-          <w:rStyle w:val="Strong"/>
-          <w:sz w:val="24"/>
-          <w:szCs w:val="24"/>
+        <w:jc w:val="center"/>
+        <w:rPr>
+          <w:rStyle w:val="Strong"/>
+          <w:rFonts w:hint="cs"/>
+          <w:sz w:val="24"/>
+          <w:szCs w:val="24"/>
+          <w:rtl/>
         </w:rPr>
       </w:pPr>
       <w:r>
@@ -286,14 +291,6 @@
         </w:rPr>
         <w:t xml:space="preserve"> اليدوي، وتوفير حل رقمي متطور يواكب احتياجات العيادة الحديثة</w:t>
       </w:r>
-      <w:r>
-        <w:rPr>
-          <w:rStyle w:val="Strong"/>
-          <w:sz w:val="24"/>
-          <w:szCs w:val="24"/>
-        </w:rPr>
-        <w:t xml:space="preserve">. </w:t>
-      </w:r>
     </w:p>
     <w:p>
       <w:pPr>
@@ -301,6 +298,19 @@
         <w:jc w:val="right"/>
         <w:rPr>
           <w:rStyle w:val="Strong"/>
+          <w:rFonts w:hint="cs"/>
+          <w:sz w:val="24"/>
+          <w:szCs w:val="24"/>
+          <w:rtl/>
+        </w:rPr>
+      </w:pPr>
+    </w:p>
+    <w:p>
+      <w:pPr>
+        <w:spacing w:before="120" w:after="120" w:line="336" w:lineRule="auto"/>
+        <w:jc w:val="right"/>
+        <w:rPr>
+          <w:rStyle w:val="Strong"/>
           <w:sz w:val="24"/>
           <w:szCs w:val="24"/>
         </w:rPr>
@@ -345,17 +355,23 @@
       <w:r>
         <w:rPr>
           <w:rStyle w:val="Strong"/>
-          <w:sz w:val="24"/>
-          <w:szCs w:val="24"/>
-        </w:rPr>
-        <w:t xml:space="preserve">: </w:t>
-      </w:r>
-    </w:p>
-    <w:p>
-      <w:pPr>
+          <w:rFonts w:hint="cs"/>
+          <w:sz w:val="24"/>
+          <w:szCs w:val="24"/>
+          <w:rtl/>
+        </w:rPr>
+        <w:t xml:space="preserve">  :</w:t>
+      </w:r>
+    </w:p>
+    <w:p>
+      <w:pPr>
+        <w:pStyle w:val="ListParagraph"/>
+        <w:numPr>
+          <w:ilvl w:val="0"/>
+          <w:numId w:val="15"/>
+        </w:numPr>
+        <w:bidi/>
         <w:spacing w:after="0" w:line="336" w:lineRule="auto"/>
-        <w:ind w:left="40"/>
-        <w:jc w:val="right"/>
         <w:rPr>
           <w:rStyle w:val="Strong"/>
           <w:sz w:val="24"/>
@@ -382,9 +398,13 @@
     </w:p>
     <w:p>
       <w:pPr>
+        <w:pStyle w:val="ListParagraph"/>
+        <w:numPr>
+          <w:ilvl w:val="0"/>
+          <w:numId w:val="15"/>
+        </w:numPr>
+        <w:bidi/>
         <w:spacing w:after="0" w:line="336" w:lineRule="auto"/>
-        <w:ind w:left="40"/>
-        <w:jc w:val="right"/>
         <w:rPr>
           <w:rStyle w:val="Strong"/>
           <w:sz w:val="24"/>
@@ -411,9 +431,13 @@
     </w:p>
     <w:p>
       <w:pPr>
+        <w:pStyle w:val="ListParagraph"/>
+        <w:numPr>
+          <w:ilvl w:val="0"/>
+          <w:numId w:val="15"/>
+        </w:numPr>
+        <w:bidi/>
         <w:spacing w:after="0" w:line="336" w:lineRule="auto"/>
-        <w:ind w:left="40"/>
-        <w:jc w:val="right"/>
         <w:rPr>
           <w:rStyle w:val="Strong"/>
           <w:sz w:val="24"/>
@@ -440,9 +464,13 @@
     </w:p>
     <w:p>
       <w:pPr>
+        <w:pStyle w:val="ListParagraph"/>
+        <w:numPr>
+          <w:ilvl w:val="0"/>
+          <w:numId w:val="15"/>
+        </w:numPr>
+        <w:bidi/>
         <w:spacing w:after="0" w:line="336" w:lineRule="auto"/>
-        <w:ind w:left="40"/>
-        <w:jc w:val="right"/>
         <w:rPr>
           <w:rStyle w:val="Strong"/>
           <w:sz w:val="24"/>
@@ -469,9 +497,13 @@
     </w:p>
     <w:p>
       <w:pPr>
+        <w:pStyle w:val="ListParagraph"/>
+        <w:numPr>
+          <w:ilvl w:val="0"/>
+          <w:numId w:val="15"/>
+        </w:numPr>
+        <w:bidi/>
         <w:spacing w:after="0" w:line="336" w:lineRule="auto"/>
-        <w:ind w:left="40"/>
-        <w:jc w:val="right"/>
         <w:rPr>
           <w:rStyle w:val="Strong"/>
           <w:sz w:val="24"/>
@@ -498,9 +530,13 @@
     </w:p>
     <w:p>
       <w:pPr>
+        <w:pStyle w:val="ListParagraph"/>
+        <w:numPr>
+          <w:ilvl w:val="0"/>
+          <w:numId w:val="15"/>
+        </w:numPr>
+        <w:bidi/>
         <w:spacing w:after="0" w:line="336" w:lineRule="auto"/>
-        <w:ind w:left="40"/>
-        <w:jc w:val="right"/>
         <w:rPr>
           <w:rStyle w:val="Strong"/>
           <w:sz w:val="24"/>
@@ -534,10 +570,469 @@
         <w:jc w:val="right"/>
         <w:rPr>
           <w:rStyle w:val="Strong"/>
-          <w:sz w:val="24"/>
-          <w:szCs w:val="24"/>
-        </w:rPr>
-      </w:pPr>
+          <w:rFonts w:hint="cs"/>
+          <w:sz w:val="24"/>
+          <w:szCs w:val="24"/>
+          <w:rtl/>
+        </w:rPr>
+      </w:pPr>
+    </w:p>
+    <w:p>
+      <w:pPr>
+        <w:pBdr>
+          <w:bottom w:val="single" w:sz="6" w:space="0" w:color="BFC3C8"/>
+        </w:pBdr>
+        <w:spacing w:before="120" w:after="120" w:line="0" w:lineRule="auto"/>
+        <w:jc w:val="right"/>
+        <w:rPr>
+          <w:rStyle w:val="Strong"/>
+          <w:rFonts w:hint="cs"/>
+          <w:sz w:val="24"/>
+          <w:szCs w:val="24"/>
+          <w:rtl/>
+        </w:rPr>
+      </w:pPr>
+    </w:p>
+    <w:p>
+      <w:pPr>
+        <w:pBdr>
+          <w:bottom w:val="single" w:sz="6" w:space="0" w:color="BFC3C8"/>
+        </w:pBdr>
+        <w:spacing w:before="120" w:after="120" w:line="0" w:lineRule="auto"/>
+        <w:jc w:val="right"/>
+        <w:rPr>
+          <w:rStyle w:val="Strong"/>
+          <w:rFonts w:hint="cs"/>
+          <w:sz w:val="24"/>
+          <w:szCs w:val="24"/>
+          <w:rtl/>
+        </w:rPr>
+      </w:pPr>
+    </w:p>
+    <w:p>
+      <w:pPr>
+        <w:pBdr>
+          <w:bottom w:val="single" w:sz="6" w:space="0" w:color="BFC3C8"/>
+        </w:pBdr>
+        <w:spacing w:before="120" w:after="120" w:line="0" w:lineRule="auto"/>
+        <w:jc w:val="right"/>
+        <w:rPr>
+          <w:rStyle w:val="Strong"/>
+          <w:rFonts w:hint="cs"/>
+          <w:sz w:val="24"/>
+          <w:szCs w:val="24"/>
+          <w:rtl/>
+        </w:rPr>
+      </w:pPr>
+    </w:p>
+    <w:p>
+      <w:pPr>
+        <w:pBdr>
+          <w:bottom w:val="single" w:sz="6" w:space="0" w:color="BFC3C8"/>
+        </w:pBdr>
+        <w:spacing w:before="120" w:after="120" w:line="0" w:lineRule="auto"/>
+        <w:jc w:val="right"/>
+        <w:rPr>
+          <w:rStyle w:val="Strong"/>
+          <w:rFonts w:hint="cs"/>
+          <w:sz w:val="24"/>
+          <w:szCs w:val="24"/>
+          <w:rtl/>
+        </w:rPr>
+      </w:pPr>
+    </w:p>
+    <w:p>
+      <w:pPr>
+        <w:pBdr>
+          <w:bottom w:val="single" w:sz="6" w:space="0" w:color="BFC3C8"/>
+        </w:pBdr>
+        <w:spacing w:before="120" w:after="120" w:line="0" w:lineRule="auto"/>
+        <w:jc w:val="right"/>
+        <w:rPr>
+          <w:rStyle w:val="Strong"/>
+          <w:rFonts w:hint="cs"/>
+          <w:sz w:val="24"/>
+          <w:szCs w:val="24"/>
+          <w:rtl/>
+        </w:rPr>
+      </w:pPr>
+    </w:p>
+    <w:p>
+      <w:pPr>
+        <w:pBdr>
+          <w:bottom w:val="single" w:sz="6" w:space="0" w:color="BFC3C8"/>
+        </w:pBdr>
+        <w:spacing w:before="120" w:after="120" w:line="0" w:lineRule="auto"/>
+        <w:jc w:val="right"/>
+        <w:rPr>
+          <w:rStyle w:val="Strong"/>
+          <w:rFonts w:hint="cs"/>
+          <w:sz w:val="24"/>
+          <w:szCs w:val="24"/>
+          <w:rtl/>
+        </w:rPr>
+      </w:pPr>
+    </w:p>
+    <w:p>
+      <w:pPr>
+        <w:pBdr>
+          <w:bottom w:val="single" w:sz="6" w:space="0" w:color="BFC3C8"/>
+        </w:pBdr>
+        <w:spacing w:before="120" w:after="120" w:line="0" w:lineRule="auto"/>
+        <w:jc w:val="right"/>
+        <w:rPr>
+          <w:rStyle w:val="Strong"/>
+          <w:rFonts w:hint="cs"/>
+          <w:sz w:val="24"/>
+          <w:szCs w:val="24"/>
+          <w:rtl/>
+        </w:rPr>
+      </w:pPr>
+    </w:p>
+    <w:p>
+      <w:pPr>
+        <w:pBdr>
+          <w:bottom w:val="single" w:sz="6" w:space="0" w:color="BFC3C8"/>
+        </w:pBdr>
+        <w:spacing w:before="120" w:after="120" w:line="0" w:lineRule="auto"/>
+        <w:jc w:val="right"/>
+        <w:rPr>
+          <w:rStyle w:val="Strong"/>
+          <w:rFonts w:hint="cs"/>
+          <w:sz w:val="24"/>
+          <w:szCs w:val="24"/>
+          <w:rtl/>
+        </w:rPr>
+      </w:pPr>
+    </w:p>
+    <w:p>
+      <w:pPr>
+        <w:pBdr>
+          <w:bottom w:val="single" w:sz="6" w:space="0" w:color="BFC3C8"/>
+        </w:pBdr>
+        <w:spacing w:before="120" w:after="120" w:line="0" w:lineRule="auto"/>
+        <w:jc w:val="right"/>
+        <w:rPr>
+          <w:rStyle w:val="Strong"/>
+          <w:rFonts w:hint="cs"/>
+          <w:sz w:val="24"/>
+          <w:szCs w:val="24"/>
+          <w:rtl/>
+        </w:rPr>
+      </w:pPr>
+    </w:p>
+    <w:p>
+      <w:pPr>
+        <w:pBdr>
+          <w:bottom w:val="single" w:sz="6" w:space="0" w:color="BFC3C8"/>
+        </w:pBdr>
+        <w:spacing w:before="120" w:after="120" w:line="0" w:lineRule="auto"/>
+        <w:jc w:val="right"/>
+        <w:rPr>
+          <w:rStyle w:val="Strong"/>
+          <w:rFonts w:hint="cs"/>
+          <w:sz w:val="24"/>
+          <w:szCs w:val="24"/>
+          <w:rtl/>
+        </w:rPr>
+      </w:pPr>
+    </w:p>
+    <w:p>
+      <w:pPr>
+        <w:pBdr>
+          <w:bottom w:val="single" w:sz="6" w:space="0" w:color="BFC3C8"/>
+        </w:pBdr>
+        <w:spacing w:before="120" w:after="120" w:line="0" w:lineRule="auto"/>
+        <w:jc w:val="right"/>
+        <w:rPr>
+          <w:rStyle w:val="Strong"/>
+          <w:rFonts w:hint="cs"/>
+          <w:sz w:val="24"/>
+          <w:szCs w:val="24"/>
+          <w:rtl/>
+        </w:rPr>
+      </w:pPr>
+    </w:p>
+    <w:p>
+      <w:pPr>
+        <w:pBdr>
+          <w:bottom w:val="single" w:sz="6" w:space="0" w:color="BFC3C8"/>
+        </w:pBdr>
+        <w:spacing w:before="120" w:after="120" w:line="0" w:lineRule="auto"/>
+        <w:jc w:val="right"/>
+        <w:rPr>
+          <w:rStyle w:val="Strong"/>
+          <w:rFonts w:hint="cs"/>
+          <w:sz w:val="24"/>
+          <w:szCs w:val="24"/>
+          <w:rtl/>
+        </w:rPr>
+      </w:pPr>
+    </w:p>
+    <w:p>
+      <w:pPr>
+        <w:pBdr>
+          <w:bottom w:val="single" w:sz="6" w:space="0" w:color="BFC3C8"/>
+        </w:pBdr>
+        <w:spacing w:before="120" w:after="120" w:line="0" w:lineRule="auto"/>
+        <w:jc w:val="right"/>
+        <w:rPr>
+          <w:rStyle w:val="Strong"/>
+          <w:rFonts w:hint="cs"/>
+          <w:sz w:val="24"/>
+          <w:szCs w:val="24"/>
+          <w:rtl/>
+        </w:rPr>
+      </w:pPr>
+    </w:p>
+    <w:p>
+      <w:pPr>
+        <w:pBdr>
+          <w:bottom w:val="single" w:sz="6" w:space="0" w:color="BFC3C8"/>
+        </w:pBdr>
+        <w:spacing w:before="120" w:after="120" w:line="0" w:lineRule="auto"/>
+        <w:jc w:val="right"/>
+        <w:rPr>
+          <w:rStyle w:val="Strong"/>
+          <w:rFonts w:hint="cs"/>
+          <w:sz w:val="24"/>
+          <w:szCs w:val="24"/>
+          <w:rtl/>
+        </w:rPr>
+      </w:pPr>
+    </w:p>
+    <w:p>
+      <w:pPr>
+        <w:pBdr>
+          <w:bottom w:val="single" w:sz="6" w:space="0" w:color="BFC3C8"/>
+        </w:pBdr>
+        <w:spacing w:before="120" w:after="120" w:line="0" w:lineRule="auto"/>
+        <w:jc w:val="right"/>
+        <w:rPr>
+          <w:rStyle w:val="Strong"/>
+          <w:rFonts w:hint="cs"/>
+          <w:sz w:val="24"/>
+          <w:szCs w:val="24"/>
+          <w:rtl/>
+        </w:rPr>
+      </w:pPr>
+    </w:p>
+    <w:p>
+      <w:pPr>
+        <w:pBdr>
+          <w:bottom w:val="single" w:sz="6" w:space="0" w:color="BFC3C8"/>
+        </w:pBdr>
+        <w:spacing w:before="120" w:after="120" w:line="0" w:lineRule="auto"/>
+        <w:jc w:val="right"/>
+        <w:rPr>
+          <w:rStyle w:val="Strong"/>
+          <w:rFonts w:hint="cs"/>
+          <w:sz w:val="24"/>
+          <w:szCs w:val="24"/>
+          <w:rtl/>
+        </w:rPr>
+      </w:pPr>
+    </w:p>
+    <w:p>
+      <w:pPr>
+        <w:pBdr>
+          <w:bottom w:val="single" w:sz="6" w:space="0" w:color="BFC3C8"/>
+        </w:pBdr>
+        <w:spacing w:before="120" w:after="120" w:line="0" w:lineRule="auto"/>
+        <w:jc w:val="right"/>
+        <w:rPr>
+          <w:rStyle w:val="Strong"/>
+          <w:rFonts w:hint="cs"/>
+          <w:sz w:val="24"/>
+          <w:szCs w:val="24"/>
+          <w:rtl/>
+        </w:rPr>
+      </w:pPr>
+    </w:p>
+    <w:p>
+      <w:pPr>
+        <w:pBdr>
+          <w:bottom w:val="single" w:sz="6" w:space="0" w:color="BFC3C8"/>
+        </w:pBdr>
+        <w:spacing w:before="120" w:after="120" w:line="0" w:lineRule="auto"/>
+        <w:jc w:val="right"/>
+        <w:rPr>
+          <w:rStyle w:val="Strong"/>
+          <w:rFonts w:hint="cs"/>
+          <w:sz w:val="24"/>
+          <w:szCs w:val="24"/>
+          <w:rtl/>
+        </w:rPr>
+      </w:pPr>
+    </w:p>
+    <w:p>
+      <w:pPr>
+        <w:pBdr>
+          <w:bottom w:val="single" w:sz="6" w:space="0" w:color="BFC3C8"/>
+        </w:pBdr>
+        <w:spacing w:before="120" w:after="120" w:line="0" w:lineRule="auto"/>
+        <w:jc w:val="right"/>
+        <w:rPr>
+          <w:rStyle w:val="Strong"/>
+          <w:rFonts w:hint="cs"/>
+          <w:sz w:val="24"/>
+          <w:szCs w:val="24"/>
+          <w:rtl/>
+        </w:rPr>
+      </w:pPr>
+    </w:p>
+    <w:p>
+      <w:pPr>
+        <w:pBdr>
+          <w:bottom w:val="single" w:sz="6" w:space="0" w:color="BFC3C8"/>
+        </w:pBdr>
+        <w:spacing w:before="120" w:after="120" w:line="0" w:lineRule="auto"/>
+        <w:jc w:val="right"/>
+        <w:rPr>
+          <w:rStyle w:val="Strong"/>
+          <w:rFonts w:hint="cs"/>
+          <w:sz w:val="24"/>
+          <w:szCs w:val="24"/>
+          <w:rtl/>
+        </w:rPr>
+      </w:pPr>
+    </w:p>
+    <w:p>
+      <w:pPr>
+        <w:pBdr>
+          <w:bottom w:val="single" w:sz="6" w:space="0" w:color="BFC3C8"/>
+        </w:pBdr>
+        <w:spacing w:before="120" w:after="120" w:line="0" w:lineRule="auto"/>
+        <w:rPr>
+          <w:rStyle w:val="Strong"/>
+          <w:rFonts w:hint="cs"/>
+          <w:sz w:val="24"/>
+          <w:szCs w:val="24"/>
+          <w:rtl/>
+        </w:rPr>
+      </w:pPr>
+    </w:p>
+    <w:p>
+      <w:pPr>
+        <w:pBdr>
+          <w:bottom w:val="single" w:sz="6" w:space="0" w:color="BFC3C8"/>
+        </w:pBdr>
+        <w:spacing w:before="120" w:after="120" w:line="0" w:lineRule="auto"/>
+        <w:jc w:val="right"/>
+        <w:rPr>
+          <w:rStyle w:val="Strong"/>
+          <w:sz w:val="24"/>
+          <w:szCs w:val="24"/>
+        </w:rPr>
+      </w:pPr>
+    </w:p>
+    <w:p>
+      <w:pPr>
+        <w:spacing w:before="120" w:after="120" w:line="336" w:lineRule="auto"/>
+        <w:ind w:left="360"/>
+        <w:jc w:val="center"/>
+        <w:rPr>
+          <w:rStyle w:val="Strong"/>
+          <w:rFonts w:hint="cs"/>
+          <w:sz w:val="24"/>
+          <w:szCs w:val="24"/>
+          <w:rtl/>
+        </w:rPr>
+      </w:pPr>
+      <w:r>
+        <w:rPr>
+          <w:rStyle w:val="Strong"/>
+          <w:sz w:val="24"/>
+          <w:szCs w:val="24"/>
+          <w:rtl/>
+        </w:rPr>
+        <w:lastRenderedPageBreak/>
+        <w:t>الباقات المتاحة</w:t>
+      </w:r>
+    </w:p>
+    <w:p>
+      <w:pPr>
+        <w:spacing w:before="120" w:after="120" w:line="336" w:lineRule="auto"/>
+        <w:ind w:left="360"/>
+        <w:jc w:val="right"/>
+        <w:rPr>
+          <w:rStyle w:val="Strong"/>
+          <w:sz w:val="24"/>
+          <w:szCs w:val="24"/>
+        </w:rPr>
+      </w:pPr>
+      <w:r>
+        <w:rPr>
+          <w:rStyle w:val="Strong"/>
+          <w:sz w:val="24"/>
+          <w:szCs w:val="24"/>
+        </w:rPr>
+        <w:t xml:space="preserve"> </w:t>
+      </w:r>
+    </w:p>
+    <w:p>
+      <w:pPr>
+        <w:spacing w:before="120" w:after="120" w:line="336" w:lineRule="auto"/>
+        <w:ind w:left="360"/>
+        <w:jc w:val="right"/>
+        <w:rPr>
+          <w:rStyle w:val="Strong"/>
+          <w:sz w:val="28"/>
+          <w:szCs w:val="28"/>
+          <w:u w:val="single"/>
+        </w:rPr>
+      </w:pPr>
+      <w:r>
+        <w:rPr>
+          <w:rStyle w:val="Strong"/>
+          <w:sz w:val="28"/>
+          <w:szCs w:val="28"/>
+          <w:u w:val="single"/>
+          <w:rtl/>
+        </w:rPr>
+        <w:t>الباقة الأساسية</w:t>
+      </w:r>
+      <w:r>
+        <w:rPr>
+          <w:rStyle w:val="Strong"/>
+          <w:sz w:val="28"/>
+          <w:szCs w:val="28"/>
+          <w:u w:val="single"/>
+        </w:rPr>
+        <w:t xml:space="preserve">(Basic) </w:t>
+      </w:r>
+      <w:r>
+        <w:rPr>
+          <w:rStyle w:val="Strong"/>
+          <w:sz w:val="28"/>
+          <w:szCs w:val="28"/>
+          <w:u w:val="single"/>
+        </w:rPr>
+        <w:t xml:space="preserve"> </w:t>
+      </w:r>
+    </w:p>
+    <w:p>
+      <w:pPr>
+        <w:spacing w:before="120" w:after="120" w:line="336" w:lineRule="auto"/>
+        <w:ind w:left="360"/>
+        <w:jc w:val="right"/>
+        <w:rPr>
+          <w:rStyle w:val="Strong"/>
+          <w:rFonts w:hint="cs"/>
+          <w:sz w:val="24"/>
+          <w:szCs w:val="24"/>
+          <w:rtl/>
+        </w:rPr>
+      </w:pPr>
+      <w:r>
+        <w:rPr>
+          <w:rStyle w:val="Strong"/>
+          <w:sz w:val="24"/>
+          <w:szCs w:val="24"/>
+          <w:rtl/>
+        </w:rPr>
+        <w:t>المميزات المتضمنة</w:t>
+      </w:r>
     </w:p>
     <w:p>
       <w:pPr>
@@ -557,17 +1052,332 @@
       <w:r>
         <w:rPr>
           <w:rStyle w:val="Strong"/>
-          <w:sz w:val="24"/>
-          <w:szCs w:val="24"/>
-          <w:rtl/>
-        </w:rPr>
-        <w:t>الباقات المتاحة</w:t>
-      </w:r>
-      <w:r>
-        <w:rPr>
-          <w:rStyle w:val="Strong"/>
-          <w:sz w:val="24"/>
-          <w:szCs w:val="24"/>
+          <w:rFonts w:hint="cs"/>
+          <w:sz w:val="24"/>
+          <w:szCs w:val="24"/>
+          <w:rtl/>
+        </w:rPr>
+        <w:t>تصميم خاص بالمركز (</w:t>
+      </w:r>
+      <w:proofErr w:type="spellStart"/>
+      <w:r>
+        <w:rPr>
+          <w:rStyle w:val="Strong"/>
+          <w:rFonts w:hint="cs"/>
+          <w:sz w:val="24"/>
+          <w:szCs w:val="24"/>
+          <w:rtl/>
+        </w:rPr>
+        <w:t>الأسم</w:t>
+      </w:r>
+      <w:proofErr w:type="spellEnd"/>
+      <w:r>
+        <w:rPr>
+          <w:rStyle w:val="Strong"/>
+          <w:rFonts w:hint="cs"/>
+          <w:sz w:val="24"/>
+          <w:szCs w:val="24"/>
+          <w:rtl/>
+        </w:rPr>
+        <w:t>-الألوان-</w:t>
+      </w:r>
+      <w:proofErr w:type="spellStart"/>
+      <w:r>
+        <w:rPr>
+          <w:rStyle w:val="Strong"/>
+          <w:rFonts w:hint="cs"/>
+          <w:sz w:val="24"/>
+          <w:szCs w:val="24"/>
+          <w:rtl/>
+        </w:rPr>
+        <w:t>الهويه</w:t>
+      </w:r>
+      <w:proofErr w:type="spellEnd"/>
+      <w:r>
+        <w:rPr>
+          <w:rStyle w:val="Strong"/>
+          <w:rFonts w:hint="cs"/>
+          <w:sz w:val="24"/>
+          <w:szCs w:val="24"/>
+          <w:rtl/>
+        </w:rPr>
+        <w:t>)</w:t>
+      </w:r>
+      <w:r>
+        <w:rPr>
+          <w:rStyle w:val="Strong"/>
+          <w:sz w:val="24"/>
+          <w:szCs w:val="24"/>
+        </w:rPr>
+        <w:t xml:space="preserve"> </w:t>
+      </w:r>
+    </w:p>
+    <w:p>
+      <w:pPr>
+        <w:numPr>
+          <w:ilvl w:val="0"/>
+          <w:numId w:val="12"/>
+        </w:numPr>
+        <w:spacing w:after="0" w:line="336" w:lineRule="auto"/>
+        <w:jc w:val="right"/>
+        <w:rPr>
+          <w:rStyle w:val="Strong"/>
+          <w:sz w:val="24"/>
+          <w:szCs w:val="24"/>
+          <w:rtl/>
+        </w:rPr>
+      </w:pPr>
+      <w:r>
+        <w:rPr>
+          <w:rStyle w:val="Strong"/>
+          <w:sz w:val="24"/>
+          <w:szCs w:val="24"/>
+          <w:rtl/>
+        </w:rPr>
+        <w:t>صفحة عرض الأطباء والتخصصات</w:t>
+      </w:r>
+    </w:p>
+    <w:p>
+      <w:pPr>
+        <w:numPr>
+          <w:ilvl w:val="0"/>
+          <w:numId w:val="12"/>
+        </w:numPr>
+        <w:spacing w:after="0" w:line="336" w:lineRule="auto"/>
+        <w:jc w:val="right"/>
+        <w:rPr>
+          <w:rStyle w:val="Strong"/>
+          <w:sz w:val="24"/>
+          <w:szCs w:val="24"/>
+        </w:rPr>
+      </w:pPr>
+      <w:r>
+        <w:rPr>
+          <w:rStyle w:val="Strong"/>
+          <w:sz w:val="24"/>
+          <w:szCs w:val="24"/>
+          <w:rtl/>
+        </w:rPr>
+        <w:t>نظام حجز بسيط وسهل الاستخدام</w:t>
+      </w:r>
+      <w:r>
+        <w:rPr>
+          <w:rStyle w:val="Strong"/>
+          <w:sz w:val="24"/>
+          <w:szCs w:val="24"/>
+        </w:rPr>
+        <w:t xml:space="preserve"> </w:t>
+      </w:r>
+    </w:p>
+    <w:p>
+      <w:pPr>
+        <w:numPr>
+          <w:ilvl w:val="0"/>
+          <w:numId w:val="12"/>
+        </w:numPr>
+        <w:spacing w:after="0" w:line="336" w:lineRule="auto"/>
+        <w:jc w:val="right"/>
+        <w:rPr>
+          <w:rStyle w:val="Strong"/>
+          <w:sz w:val="24"/>
+          <w:szCs w:val="24"/>
+        </w:rPr>
+      </w:pPr>
+      <w:r>
+        <w:rPr>
+          <w:rStyle w:val="Strong"/>
+          <w:sz w:val="24"/>
+          <w:szCs w:val="24"/>
+          <w:rtl/>
+        </w:rPr>
+        <w:t>تسجيل بيانات المريض الأساسية</w:t>
+      </w:r>
+      <w:r>
+        <w:rPr>
+          <w:rStyle w:val="Strong"/>
+          <w:sz w:val="24"/>
+          <w:szCs w:val="24"/>
+        </w:rPr>
+        <w:t xml:space="preserve"> </w:t>
+      </w:r>
+    </w:p>
+    <w:p>
+      <w:pPr>
+        <w:numPr>
+          <w:ilvl w:val="0"/>
+          <w:numId w:val="12"/>
+        </w:numPr>
+        <w:spacing w:after="0" w:line="336" w:lineRule="auto"/>
+        <w:jc w:val="right"/>
+        <w:rPr>
+          <w:rStyle w:val="Strong"/>
+          <w:rFonts w:hint="cs"/>
+          <w:sz w:val="24"/>
+          <w:szCs w:val="24"/>
+        </w:rPr>
+      </w:pPr>
+      <w:r>
+        <w:rPr>
+          <w:rStyle w:val="Strong"/>
+          <w:sz w:val="24"/>
+          <w:szCs w:val="24"/>
+          <w:rtl/>
+        </w:rPr>
+        <w:t>عرض المواعيد المتاحة لكل طبيب</w:t>
+      </w:r>
+    </w:p>
+    <w:p>
+      <w:pPr>
+        <w:numPr>
+          <w:ilvl w:val="0"/>
+          <w:numId w:val="12"/>
+        </w:numPr>
+        <w:spacing w:after="0" w:line="336" w:lineRule="auto"/>
+        <w:jc w:val="right"/>
+        <w:rPr>
+          <w:rStyle w:val="Strong"/>
+          <w:sz w:val="24"/>
+          <w:szCs w:val="24"/>
+        </w:rPr>
+      </w:pPr>
+      <w:r>
+        <w:rPr>
+          <w:rStyle w:val="Strong"/>
+          <w:sz w:val="24"/>
+          <w:szCs w:val="24"/>
+          <w:rtl/>
+        </w:rPr>
+        <w:t>تصميم متجاوب</w:t>
+      </w:r>
+      <w:r>
+        <w:rPr>
+          <w:rStyle w:val="Strong"/>
+          <w:sz w:val="24"/>
+          <w:szCs w:val="24"/>
+        </w:rPr>
+        <w:t xml:space="preserve"> (Responsive) </w:t>
+      </w:r>
+      <w:r>
+        <w:rPr>
+          <w:rStyle w:val="Strong"/>
+          <w:sz w:val="24"/>
+          <w:szCs w:val="24"/>
+          <w:rtl/>
+        </w:rPr>
+        <w:t>يعمل على جميع الأجهزة</w:t>
+      </w:r>
+      <w:r>
+        <w:rPr>
+          <w:rStyle w:val="Strong"/>
+          <w:sz w:val="24"/>
+          <w:szCs w:val="24"/>
+        </w:rPr>
+        <w:t xml:space="preserve"> </w:t>
+      </w:r>
+    </w:p>
+    <w:p>
+      <w:pPr>
+        <w:spacing w:before="120" w:after="120" w:line="336" w:lineRule="auto"/>
+        <w:ind w:left="360"/>
+        <w:jc w:val="right"/>
+        <w:rPr>
+          <w:rStyle w:val="Strong"/>
+          <w:sz w:val="24"/>
+          <w:szCs w:val="24"/>
+          <w:u w:val="single"/>
+        </w:rPr>
+      </w:pPr>
+      <w:r>
+        <w:rPr>
+          <w:rStyle w:val="Strong"/>
+          <w:rFonts w:hint="cs"/>
+          <w:sz w:val="24"/>
+          <w:szCs w:val="24"/>
+          <w:u w:val="single"/>
+          <w:rtl/>
+        </w:rPr>
+        <w:t xml:space="preserve">السعر : 12000 جنيه </w:t>
+      </w:r>
+      <w:r>
+        <w:rPr>
+          <w:rStyle w:val="Strong"/>
+          <w:sz w:val="24"/>
+          <w:szCs w:val="24"/>
+          <w:u w:val="single"/>
+          <w:rtl/>
+        </w:rPr>
+        <w:t xml:space="preserve"> </w:t>
+      </w:r>
+      <w:r>
+        <w:rPr>
+          <w:rStyle w:val="Strong"/>
+          <w:rFonts w:hint="cs"/>
+          <w:sz w:val="24"/>
+          <w:szCs w:val="24"/>
+          <w:u w:val="single"/>
+          <w:rtl/>
+        </w:rPr>
+        <w:t>+ (</w:t>
+      </w:r>
+      <w:r>
+        <w:rPr>
+          <w:rStyle w:val="Strong"/>
+          <w:rFonts w:ascii="Arial" w:hAnsi="Arial" w:cs="Arial" w:hint="cs"/>
+          <w:sz w:val="24"/>
+          <w:szCs w:val="24"/>
+          <w:u w:val="single"/>
+          <w:rtl/>
+        </w:rPr>
+        <w:t xml:space="preserve"> 5 % ) 600 جنيه </w:t>
+      </w:r>
+      <w:r>
+        <w:rPr>
+          <w:rStyle w:val="Strong"/>
+          <w:rFonts w:ascii="Arial" w:hAnsi="Arial" w:cs="Arial" w:hint="cs"/>
+          <w:sz w:val="24"/>
+          <w:szCs w:val="24"/>
+          <w:u w:val="single"/>
+          <w:rtl/>
+        </w:rPr>
+        <w:t>رسوم</w:t>
+      </w:r>
+      <w:r>
+        <w:rPr>
+          <w:rStyle w:val="Strong"/>
+          <w:sz w:val="24"/>
+          <w:szCs w:val="24"/>
+          <w:u w:val="single"/>
+          <w:rtl/>
+        </w:rPr>
+        <w:t xml:space="preserve"> </w:t>
+      </w:r>
+      <w:r>
+        <w:rPr>
+          <w:rStyle w:val="Strong"/>
+          <w:rFonts w:ascii="Arial" w:hAnsi="Arial" w:cs="Arial" w:hint="cs"/>
+          <w:sz w:val="24"/>
+          <w:szCs w:val="24"/>
+          <w:u w:val="single"/>
+          <w:rtl/>
+        </w:rPr>
+        <w:t>الشهرية</w:t>
+      </w:r>
+      <w:r>
+        <w:rPr>
+          <w:rStyle w:val="Strong"/>
+          <w:sz w:val="24"/>
+          <w:szCs w:val="24"/>
+          <w:u w:val="single"/>
+          <w:rtl/>
+        </w:rPr>
+        <w:t>:</w:t>
+      </w:r>
+      <w:r>
+        <w:rPr>
+          <w:rStyle w:val="Strong"/>
+          <w:sz w:val="24"/>
+          <w:szCs w:val="24"/>
+          <w:u w:val="single"/>
         </w:rPr>
         <w:t xml:space="preserve"> </w:t>
       </w:r>
@@ -594,15 +1404,189 @@
           <w:szCs w:val="24"/>
           <w:rtl/>
         </w:rPr>
-        <w:t>الباقة الأساسية</w:t>
-      </w:r>
-      <w:r>
-        <w:rPr>
-          <w:rStyle w:val="Strong"/>
-          <w:sz w:val="24"/>
-          <w:szCs w:val="24"/>
-        </w:rPr>
-        <w:t xml:space="preserve"> (Basic) </w:t>
+        <w:t>تشمل الرسوم الشهرية</w:t>
+      </w:r>
+      <w:r>
+        <w:rPr>
+          <w:rStyle w:val="Strong"/>
+          <w:sz w:val="24"/>
+          <w:szCs w:val="24"/>
+        </w:rPr>
+        <w:t xml:space="preserve"> </w:t>
+      </w:r>
+    </w:p>
+    <w:p>
+      <w:pPr>
+        <w:numPr>
+          <w:ilvl w:val="0"/>
+          <w:numId w:val="12"/>
+        </w:numPr>
+        <w:spacing w:after="0" w:line="336" w:lineRule="auto"/>
+        <w:jc w:val="right"/>
+        <w:rPr>
+          <w:rStyle w:val="Strong"/>
+          <w:sz w:val="24"/>
+          <w:szCs w:val="24"/>
+        </w:rPr>
+      </w:pPr>
+      <w:r>
+        <w:rPr>
+          <w:rStyle w:val="Strong"/>
+          <w:sz w:val="24"/>
+          <w:szCs w:val="24"/>
+          <w:rtl/>
+        </w:rPr>
+        <w:t>الدومين والاستضافة</w:t>
+      </w:r>
+      <w:r>
+        <w:rPr>
+          <w:rStyle w:val="Strong"/>
+          <w:sz w:val="24"/>
+          <w:szCs w:val="24"/>
+        </w:rPr>
+        <w:t xml:space="preserve"> </w:t>
+      </w:r>
+    </w:p>
+    <w:p>
+      <w:pPr>
+        <w:numPr>
+          <w:ilvl w:val="0"/>
+          <w:numId w:val="12"/>
+        </w:numPr>
+        <w:spacing w:after="0" w:line="336" w:lineRule="auto"/>
+        <w:jc w:val="right"/>
+        <w:rPr>
+          <w:rStyle w:val="Strong"/>
+          <w:sz w:val="24"/>
+          <w:szCs w:val="24"/>
+        </w:rPr>
+      </w:pPr>
+      <w:r>
+        <w:rPr>
+          <w:rStyle w:val="Strong"/>
+          <w:sz w:val="24"/>
+          <w:szCs w:val="24"/>
+          <w:rtl/>
+        </w:rPr>
+        <w:t>إدخال بيانات الأطباء</w:t>
+      </w:r>
+      <w:r>
+        <w:rPr>
+          <w:rStyle w:val="Strong"/>
+          <w:sz w:val="24"/>
+          <w:szCs w:val="24"/>
+        </w:rPr>
+        <w:t xml:space="preserve"> </w:t>
+      </w:r>
+    </w:p>
+    <w:p>
+      <w:pPr>
+        <w:numPr>
+          <w:ilvl w:val="0"/>
+          <w:numId w:val="12"/>
+        </w:numPr>
+        <w:spacing w:after="0" w:line="336" w:lineRule="auto"/>
+        <w:jc w:val="right"/>
+        <w:rPr>
+          <w:rStyle w:val="Strong"/>
+          <w:sz w:val="24"/>
+          <w:szCs w:val="24"/>
+        </w:rPr>
+      </w:pPr>
+      <w:r>
+        <w:rPr>
+          <w:rStyle w:val="Strong"/>
+          <w:sz w:val="24"/>
+          <w:szCs w:val="24"/>
+          <w:rtl/>
+        </w:rPr>
+        <w:t>الدعم الفني الأساسي</w:t>
+      </w:r>
+      <w:r>
+        <w:rPr>
+          <w:rStyle w:val="Strong"/>
+          <w:sz w:val="24"/>
+          <w:szCs w:val="24"/>
+        </w:rPr>
+        <w:t xml:space="preserve"> </w:t>
+      </w:r>
+    </w:p>
+    <w:p>
+      <w:pPr>
+        <w:numPr>
+          <w:ilvl w:val="0"/>
+          <w:numId w:val="12"/>
+        </w:numPr>
+        <w:spacing w:after="0" w:line="336" w:lineRule="auto"/>
+        <w:jc w:val="right"/>
+        <w:rPr>
+          <w:rStyle w:val="Strong"/>
+          <w:sz w:val="24"/>
+          <w:szCs w:val="24"/>
+        </w:rPr>
+      </w:pPr>
+      <w:r>
+        <w:rPr>
+          <w:rStyle w:val="Strong"/>
+          <w:sz w:val="24"/>
+          <w:szCs w:val="24"/>
+          <w:rtl/>
+        </w:rPr>
+        <w:t>متابعة تشغيل النظام</w:t>
+      </w:r>
+      <w:r>
+        <w:rPr>
+          <w:rStyle w:val="Strong"/>
+          <w:sz w:val="24"/>
+          <w:szCs w:val="24"/>
+        </w:rPr>
+        <w:t xml:space="preserve"> </w:t>
+      </w:r>
+    </w:p>
+    <w:p>
+      <w:pPr>
+        <w:pBdr>
+          <w:bottom w:val="single" w:sz="6" w:space="0" w:color="BFC3C8"/>
+        </w:pBdr>
+        <w:spacing w:before="120" w:after="120" w:line="0" w:lineRule="auto"/>
+        <w:jc w:val="right"/>
+        <w:rPr>
+          <w:rStyle w:val="Strong"/>
+          <w:sz w:val="24"/>
+          <w:szCs w:val="24"/>
+        </w:rPr>
+      </w:pPr>
+    </w:p>
+    <w:p>
+      <w:pPr>
+        <w:spacing w:before="120" w:after="120" w:line="336" w:lineRule="auto"/>
+        <w:ind w:left="360"/>
+        <w:jc w:val="right"/>
+        <w:rPr>
+          <w:rStyle w:val="Strong"/>
+          <w:sz w:val="28"/>
+          <w:szCs w:val="28"/>
+          <w:u w:val="single"/>
+        </w:rPr>
+      </w:pPr>
+      <w:r>
+        <w:rPr>
+          <w:rStyle w:val="Strong"/>
+          <w:sz w:val="28"/>
+          <w:szCs w:val="28"/>
+          <w:u w:val="single"/>
+          <w:rtl/>
+        </w:rPr>
+        <w:t>الباقة المتوسطة</w:t>
+      </w:r>
+      <w:r>
+        <w:rPr>
+          <w:rStyle w:val="Strong"/>
+          <w:sz w:val="28"/>
+          <w:szCs w:val="28"/>
+          <w:u w:val="single"/>
+        </w:rPr>
+        <w:t xml:space="preserve"> (Standard) </w:t>
       </w:r>
     </w:p>
     <w:p>
@@ -627,7 +1611,7 @@
           <w:szCs w:val="24"/>
           <w:rtl/>
         </w:rPr>
-        <w:t>المميزات المتضمنة</w:t>
+        <w:t>تشمل كل ما في الباقة الأساسية بالإضافة إلى</w:t>
       </w:r>
       <w:r>
         <w:rPr>
@@ -659,7 +1643,7 @@
           <w:szCs w:val="24"/>
           <w:rtl/>
         </w:rPr>
-        <w:t>صفحة عرض الأطباء والتخصصات</w:t>
+        <w:t>لوحة تحكم متقدمة للإدارة</w:t>
       </w:r>
       <w:r>
         <w:rPr>
@@ -684,22 +1668,78 @@
           <w:szCs w:val="24"/>
         </w:rPr>
       </w:pPr>
-      <w:r>
-        <w:rPr>
-          <w:rStyle w:val="Strong"/>
-          <w:sz w:val="24"/>
-          <w:szCs w:val="24"/>
-          <w:rtl/>
-        </w:rPr>
-        <w:t>نظام حجز بسيط وسهل الاستخدام</w:t>
-      </w:r>
-      <w:r>
-        <w:rPr>
-          <w:rStyle w:val="Strong"/>
-          <w:sz w:val="24"/>
-          <w:szCs w:val="24"/>
-        </w:rPr>
-        <w:t xml:space="preserve"> </w:t>
+      <w:proofErr w:type="spellStart"/>
+      <w:r>
+        <w:rPr>
+          <w:rStyle w:val="Strong"/>
+          <w:rFonts w:hint="cs"/>
+          <w:sz w:val="24"/>
+          <w:szCs w:val="24"/>
+          <w:rtl/>
+        </w:rPr>
+        <w:t>أمكانيه</w:t>
+      </w:r>
+      <w:proofErr w:type="spellEnd"/>
+      <w:r>
+        <w:rPr>
+          <w:rStyle w:val="Strong"/>
+          <w:rFonts w:hint="cs"/>
+          <w:sz w:val="24"/>
+          <w:szCs w:val="24"/>
+          <w:rtl/>
+        </w:rPr>
+        <w:t xml:space="preserve">  </w:t>
+      </w:r>
+      <w:r>
+        <w:rPr>
+          <w:rStyle w:val="Strong"/>
+          <w:rFonts w:hint="cs"/>
+          <w:sz w:val="24"/>
+          <w:szCs w:val="24"/>
+          <w:rtl/>
+        </w:rPr>
+        <w:t xml:space="preserve">تغيير </w:t>
+      </w:r>
+      <w:r>
+        <w:rPr>
+          <w:rStyle w:val="Strong"/>
+          <w:rFonts w:hint="cs"/>
+          <w:sz w:val="24"/>
+          <w:szCs w:val="24"/>
+          <w:rtl/>
+          <w:lang w:bidi="ar-EG"/>
+        </w:rPr>
+        <w:t>أ</w:t>
+      </w:r>
+      <w:r>
+        <w:rPr>
+          <w:rStyle w:val="Strong"/>
+          <w:rFonts w:hint="cs"/>
+          <w:sz w:val="24"/>
+          <w:szCs w:val="24"/>
+          <w:rtl/>
+        </w:rPr>
+        <w:t xml:space="preserve">و أضافه </w:t>
+      </w:r>
+      <w:r>
+        <w:rPr>
+          <w:rStyle w:val="Strong"/>
+          <w:rFonts w:hint="cs"/>
+          <w:sz w:val="24"/>
+          <w:szCs w:val="24"/>
+          <w:rtl/>
+        </w:rPr>
+        <w:t>أ</w:t>
+      </w:r>
+      <w:r>
+        <w:rPr>
+          <w:rStyle w:val="Strong"/>
+          <w:rFonts w:hint="cs"/>
+          <w:sz w:val="24"/>
+          <w:szCs w:val="24"/>
+          <w:rtl/>
+        </w:rPr>
+        <w:t>و حذف مواعيد الاطباء يوميا</w:t>
       </w:r>
     </w:p>
     <w:p>
@@ -723,7 +1763,7 @@
           <w:szCs w:val="24"/>
           <w:rtl/>
         </w:rPr>
-        <w:t>تسجيل بيانات المريض الأساسية</w:t>
+        <w:t>إدارة حالات الحجوزات (مؤكد، ملغي، مكتمل)</w:t>
       </w:r>
       <w:r>
         <w:rPr>
@@ -744,26 +1784,19 @@
         <w:jc w:val="right"/>
         <w:rPr>
           <w:rStyle w:val="Strong"/>
-          <w:sz w:val="24"/>
-          <w:szCs w:val="24"/>
-        </w:rPr>
-      </w:pPr>
-      <w:r>
-        <w:rPr>
-          <w:rStyle w:val="Strong"/>
-          <w:sz w:val="24"/>
-          <w:szCs w:val="24"/>
-          <w:rtl/>
-        </w:rPr>
-        <w:t>عرض المواعيد المتاحة لكل طبيب</w:t>
-      </w:r>
-      <w:r>
-        <w:rPr>
-          <w:rStyle w:val="Strong"/>
-          <w:sz w:val="24"/>
-          <w:szCs w:val="24"/>
-        </w:rPr>
-        <w:t xml:space="preserve"> </w:t>
+          <w:rFonts w:hint="cs"/>
+          <w:sz w:val="24"/>
+          <w:szCs w:val="24"/>
+        </w:rPr>
+      </w:pPr>
+      <w:r>
+        <w:rPr>
+          <w:rStyle w:val="Strong"/>
+          <w:sz w:val="24"/>
+          <w:szCs w:val="24"/>
+          <w:rtl/>
+        </w:rPr>
+        <w:t>تقارير أساسية للحجوزات</w:t>
       </w:r>
     </w:p>
     <w:p>
@@ -775,37 +1808,13 @@
         <w:spacing w:after="0" w:line="336" w:lineRule="auto"/>
         <w:jc w:val="right"/>
         <w:rPr>
-          <w:rStyle w:val="Strong"/>
-          <w:sz w:val="24"/>
-          <w:szCs w:val="24"/>
-        </w:rPr>
-      </w:pPr>
-      <w:r>
-        <w:rPr>
-          <w:rStyle w:val="Strong"/>
-          <w:sz w:val="24"/>
-          <w:szCs w:val="24"/>
-          <w:rtl/>
-        </w:rPr>
-        <w:t>تصميم متجاوب</w:t>
-      </w:r>
-      <w:r>
-        <w:rPr>
-          <w:rStyle w:val="Strong"/>
-          <w:sz w:val="24"/>
-          <w:szCs w:val="24"/>
-        </w:rPr>
-        <w:t xml:space="preserve"> (Responsive) </w:t>
-      </w:r>
-      <w:r>
-        <w:rPr>
-          <w:rStyle w:val="Strong"/>
-          <w:sz w:val="24"/>
-          <w:szCs w:val="24"/>
-          <w:rtl/>
-        </w:rPr>
-        <w:t>يعمل على جميع الأجهزة</w:t>
-      </w:r>
+          <w:rFonts w:hint="cs"/>
+          <w:b/>
+          <w:bCs/>
+          <w:sz w:val="24"/>
+          <w:szCs w:val="24"/>
+        </w:rPr>
+      </w:pPr>
       <w:r>
         <w:rPr>
           <w:rStyle w:val="Strong"/>
@@ -813,6 +1822,493 @@
           <w:szCs w:val="24"/>
         </w:rPr>
         <w:t xml:space="preserve"> </w:t>
+      </w:r>
+      <w:r>
+        <w:rPr>
+          <w:rFonts w:hint="cs"/>
+          <w:b/>
+          <w:bCs/>
+          <w:sz w:val="24"/>
+          <w:szCs w:val="24"/>
+          <w:rtl/>
+        </w:rPr>
+        <w:t>شاشه للاستقبال لمتابعه كل الحجوزات والأدوار</w:t>
+      </w:r>
+    </w:p>
+    <w:p>
+      <w:pPr>
+        <w:numPr>
+          <w:ilvl w:val="0"/>
+          <w:numId w:val="12"/>
+        </w:numPr>
+        <w:spacing w:after="0" w:line="336" w:lineRule="auto"/>
+        <w:jc w:val="right"/>
+        <w:rPr>
+          <w:rFonts w:hint="cs"/>
+          <w:b/>
+          <w:bCs/>
+          <w:sz w:val="24"/>
+          <w:szCs w:val="24"/>
+        </w:rPr>
+      </w:pPr>
+      <w:r>
+        <w:rPr>
+          <w:rFonts w:hint="cs"/>
+          <w:b/>
+          <w:bCs/>
+          <w:sz w:val="24"/>
+          <w:szCs w:val="24"/>
+          <w:rtl/>
+        </w:rPr>
+        <w:t>عمل تقارير مفصلة / اجماليه لكل الحالات</w:t>
+      </w:r>
+    </w:p>
+    <w:p>
+      <w:pPr>
+        <w:numPr>
+          <w:ilvl w:val="0"/>
+          <w:numId w:val="12"/>
+        </w:numPr>
+        <w:spacing w:after="0" w:line="336" w:lineRule="auto"/>
+        <w:jc w:val="right"/>
+        <w:rPr>
+          <w:rFonts w:hint="cs"/>
+          <w:b/>
+          <w:bCs/>
+          <w:sz w:val="24"/>
+          <w:szCs w:val="24"/>
+        </w:rPr>
+      </w:pPr>
+      <w:r>
+        <w:rPr>
+          <w:rFonts w:hint="cs"/>
+          <w:b/>
+          <w:bCs/>
+          <w:sz w:val="24"/>
+          <w:szCs w:val="24"/>
+          <w:rtl/>
+        </w:rPr>
+        <w:t xml:space="preserve">امكانيه  تحميل اي تقرير حسب (التخصص / </w:t>
+      </w:r>
+      <w:proofErr w:type="spellStart"/>
+      <w:r>
+        <w:rPr>
+          <w:rFonts w:hint="cs"/>
+          <w:b/>
+          <w:bCs/>
+          <w:sz w:val="24"/>
+          <w:szCs w:val="24"/>
+          <w:rtl/>
+        </w:rPr>
+        <w:t>الطبييب</w:t>
+      </w:r>
+      <w:proofErr w:type="spellEnd"/>
+      <w:r>
+        <w:rPr>
+          <w:rFonts w:hint="cs"/>
+          <w:b/>
+          <w:bCs/>
+          <w:sz w:val="24"/>
+          <w:szCs w:val="24"/>
+          <w:rtl/>
+        </w:rPr>
+        <w:t xml:space="preserve"> / التاريخ / ... ) </w:t>
+      </w:r>
+    </w:p>
+    <w:p>
+      <w:pPr>
+        <w:numPr>
+          <w:ilvl w:val="0"/>
+          <w:numId w:val="12"/>
+        </w:numPr>
+        <w:spacing w:after="0" w:line="336" w:lineRule="auto"/>
+        <w:jc w:val="right"/>
+        <w:rPr>
+          <w:b/>
+          <w:bCs/>
+          <w:sz w:val="24"/>
+          <w:szCs w:val="24"/>
+        </w:rPr>
+      </w:pPr>
+      <w:r>
+        <w:rPr>
+          <w:rFonts w:hint="cs"/>
+          <w:b/>
+          <w:bCs/>
+          <w:sz w:val="24"/>
+          <w:szCs w:val="24"/>
+          <w:rtl/>
+        </w:rPr>
+        <w:t>امكانيه الحجز من الاستقبال لكل التخصصات</w:t>
+      </w:r>
+      <w:r>
+        <w:rPr>
+          <w:b/>
+          <w:bCs/>
+          <w:sz w:val="24"/>
+          <w:szCs w:val="24"/>
+        </w:rPr>
+        <w:t xml:space="preserve"> </w:t>
+      </w:r>
+    </w:p>
+    <w:p>
+      <w:pPr>
+        <w:spacing w:after="0" w:line="336" w:lineRule="auto"/>
+        <w:jc w:val="right"/>
+        <w:rPr>
+          <w:rStyle w:val="Strong"/>
+          <w:rFonts w:hint="cs"/>
+          <w:sz w:val="24"/>
+          <w:szCs w:val="24"/>
+        </w:rPr>
+      </w:pPr>
+    </w:p>
+    <w:p>
+      <w:pPr>
+        <w:spacing w:after="0" w:line="336" w:lineRule="auto"/>
+        <w:ind w:left="720"/>
+        <w:jc w:val="right"/>
+        <w:rPr>
+          <w:rStyle w:val="Strong"/>
+          <w:rFonts w:hint="cs"/>
+          <w:sz w:val="24"/>
+          <w:szCs w:val="24"/>
+          <w:u w:val="single"/>
+        </w:rPr>
+      </w:pPr>
+      <w:r>
+        <w:rPr>
+          <w:rStyle w:val="Strong"/>
+          <w:rFonts w:cs="Arial"/>
+          <w:sz w:val="24"/>
+          <w:szCs w:val="24"/>
+          <w:u w:val="single"/>
+          <w:rtl/>
+        </w:rPr>
+        <w:t>السعر : 1</w:t>
+      </w:r>
+      <w:r>
+        <w:rPr>
+          <w:rStyle w:val="Strong"/>
+          <w:rFonts w:cs="Arial" w:hint="cs"/>
+          <w:sz w:val="24"/>
+          <w:szCs w:val="24"/>
+          <w:u w:val="single"/>
+          <w:rtl/>
+        </w:rPr>
+        <w:t>5</w:t>
+      </w:r>
+      <w:r>
+        <w:rPr>
+          <w:rStyle w:val="Strong"/>
+          <w:rFonts w:cs="Arial"/>
+          <w:sz w:val="24"/>
+          <w:szCs w:val="24"/>
+          <w:u w:val="single"/>
+          <w:rtl/>
+        </w:rPr>
+        <w:t xml:space="preserve">000 جنيه  + ( 5 % ) </w:t>
+      </w:r>
+      <w:r>
+        <w:rPr>
+          <w:rStyle w:val="Strong"/>
+          <w:rFonts w:cs="Arial" w:hint="cs"/>
+          <w:sz w:val="24"/>
+          <w:szCs w:val="24"/>
+          <w:u w:val="single"/>
+          <w:rtl/>
+        </w:rPr>
+        <w:t>75</w:t>
+      </w:r>
+      <w:r>
+        <w:rPr>
+          <w:rStyle w:val="Strong"/>
+          <w:rFonts w:cs="Arial"/>
+          <w:sz w:val="24"/>
+          <w:szCs w:val="24"/>
+          <w:u w:val="single"/>
+          <w:rtl/>
+        </w:rPr>
+        <w:t xml:space="preserve">0 جنيه رسوم </w:t>
+      </w:r>
+      <w:r>
+        <w:rPr>
+          <w:rStyle w:val="Strong"/>
+          <w:rFonts w:cs="Arial" w:hint="cs"/>
+          <w:sz w:val="24"/>
+          <w:szCs w:val="24"/>
+          <w:u w:val="single"/>
+          <w:rtl/>
+        </w:rPr>
+        <w:t>شهريا</w:t>
+      </w:r>
+    </w:p>
+    <w:p>
+      <w:pPr>
+        <w:spacing w:after="0" w:line="336" w:lineRule="auto"/>
+        <w:ind w:left="360"/>
+        <w:jc w:val="right"/>
+        <w:rPr>
+          <w:rStyle w:val="Strong"/>
+          <w:sz w:val="24"/>
+          <w:szCs w:val="24"/>
+        </w:rPr>
+      </w:pPr>
+      <w:r>
+        <w:rPr>
+          <w:rStyle w:val="Strong"/>
+          <w:sz w:val="24"/>
+          <w:szCs w:val="24"/>
+          <w:rtl/>
+        </w:rPr>
+        <w:t>تشمل الرسوم الشهرية</w:t>
+      </w:r>
+      <w:r>
+        <w:rPr>
+          <w:rStyle w:val="Strong"/>
+          <w:sz w:val="24"/>
+          <w:szCs w:val="24"/>
+        </w:rPr>
+        <w:t xml:space="preserve"> </w:t>
+      </w:r>
+    </w:p>
+    <w:p>
+      <w:pPr>
+        <w:numPr>
+          <w:ilvl w:val="0"/>
+          <w:numId w:val="12"/>
+        </w:numPr>
+        <w:spacing w:after="0" w:line="336" w:lineRule="auto"/>
+        <w:jc w:val="right"/>
+        <w:rPr>
+          <w:rStyle w:val="Strong"/>
+          <w:sz w:val="24"/>
+          <w:szCs w:val="24"/>
+        </w:rPr>
+      </w:pPr>
+      <w:r>
+        <w:rPr>
+          <w:rStyle w:val="Strong"/>
+          <w:sz w:val="24"/>
+          <w:szCs w:val="24"/>
+          <w:rtl/>
+        </w:rPr>
+        <w:t>جميع مميزات الباقة الأساسية</w:t>
+      </w:r>
+      <w:r>
+        <w:rPr>
+          <w:rStyle w:val="Strong"/>
+          <w:sz w:val="24"/>
+          <w:szCs w:val="24"/>
+        </w:rPr>
+        <w:t xml:space="preserve"> </w:t>
+      </w:r>
+    </w:p>
+    <w:p>
+      <w:pPr>
+        <w:numPr>
+          <w:ilvl w:val="0"/>
+          <w:numId w:val="12"/>
+        </w:numPr>
+        <w:spacing w:after="0" w:line="336" w:lineRule="auto"/>
+        <w:jc w:val="right"/>
+        <w:rPr>
+          <w:rStyle w:val="Strong"/>
+          <w:sz w:val="24"/>
+          <w:szCs w:val="24"/>
+        </w:rPr>
+      </w:pPr>
+      <w:r>
+        <w:rPr>
+          <w:rStyle w:val="Strong"/>
+          <w:sz w:val="24"/>
+          <w:szCs w:val="24"/>
+          <w:rtl/>
+        </w:rPr>
+        <w:t>دعم فني محسن</w:t>
+      </w:r>
+      <w:r>
+        <w:rPr>
+          <w:rStyle w:val="Strong"/>
+          <w:sz w:val="24"/>
+          <w:szCs w:val="24"/>
+        </w:rPr>
+        <w:t xml:space="preserve"> </w:t>
+      </w:r>
+    </w:p>
+    <w:p>
+      <w:pPr>
+        <w:numPr>
+          <w:ilvl w:val="0"/>
+          <w:numId w:val="12"/>
+        </w:numPr>
+        <w:spacing w:after="0" w:line="336" w:lineRule="auto"/>
+        <w:jc w:val="right"/>
+        <w:rPr>
+          <w:rStyle w:val="Strong"/>
+          <w:sz w:val="24"/>
+          <w:szCs w:val="24"/>
+        </w:rPr>
+      </w:pPr>
+      <w:r>
+        <w:rPr>
+          <w:rStyle w:val="Strong"/>
+          <w:sz w:val="24"/>
+          <w:szCs w:val="24"/>
+          <w:rtl/>
+        </w:rPr>
+        <w:t>تحديثات دورية للنظام</w:t>
+      </w:r>
+      <w:r>
+        <w:rPr>
+          <w:rStyle w:val="Strong"/>
+          <w:sz w:val="24"/>
+          <w:szCs w:val="24"/>
+        </w:rPr>
+        <w:t xml:space="preserve"> </w:t>
+      </w:r>
+    </w:p>
+    <w:p>
+      <w:pPr>
+        <w:pBdr>
+          <w:bottom w:val="single" w:sz="6" w:space="0" w:color="BFC3C8"/>
+        </w:pBdr>
+        <w:spacing w:before="120" w:after="120" w:line="0" w:lineRule="auto"/>
+        <w:jc w:val="right"/>
+        <w:rPr>
+          <w:rStyle w:val="Strong"/>
+          <w:rFonts w:hint="cs"/>
+          <w:sz w:val="24"/>
+          <w:szCs w:val="24"/>
+          <w:rtl/>
+        </w:rPr>
+      </w:pPr>
+    </w:p>
+    <w:p>
+      <w:pPr>
+        <w:pBdr>
+          <w:bottom w:val="single" w:sz="6" w:space="0" w:color="BFC3C8"/>
+        </w:pBdr>
+        <w:spacing w:before="120" w:after="120" w:line="0" w:lineRule="auto"/>
+        <w:jc w:val="right"/>
+        <w:rPr>
+          <w:rStyle w:val="Strong"/>
+          <w:rFonts w:hint="cs"/>
+          <w:sz w:val="24"/>
+          <w:szCs w:val="24"/>
+          <w:rtl/>
+        </w:rPr>
+      </w:pPr>
+    </w:p>
+    <w:p>
+      <w:pPr>
+        <w:pBdr>
+          <w:bottom w:val="single" w:sz="6" w:space="0" w:color="BFC3C8"/>
+        </w:pBdr>
+        <w:spacing w:before="120" w:after="120" w:line="0" w:lineRule="auto"/>
+        <w:jc w:val="right"/>
+        <w:rPr>
+          <w:rStyle w:val="Strong"/>
+          <w:rFonts w:hint="cs"/>
+          <w:sz w:val="24"/>
+          <w:szCs w:val="24"/>
+          <w:rtl/>
+        </w:rPr>
+      </w:pPr>
+    </w:p>
+    <w:p>
+      <w:pPr>
+        <w:pBdr>
+          <w:bottom w:val="single" w:sz="6" w:space="0" w:color="BFC3C8"/>
+        </w:pBdr>
+        <w:spacing w:before="120" w:after="120" w:line="0" w:lineRule="auto"/>
+        <w:jc w:val="right"/>
+        <w:rPr>
+          <w:rStyle w:val="Strong"/>
+          <w:rFonts w:hint="cs"/>
+          <w:sz w:val="24"/>
+          <w:szCs w:val="24"/>
+          <w:rtl/>
+        </w:rPr>
+      </w:pPr>
+    </w:p>
+    <w:p>
+      <w:pPr>
+        <w:pBdr>
+          <w:bottom w:val="single" w:sz="6" w:space="0" w:color="BFC3C8"/>
+        </w:pBdr>
+        <w:spacing w:before="120" w:after="120" w:line="0" w:lineRule="auto"/>
+        <w:jc w:val="right"/>
+        <w:rPr>
+          <w:rStyle w:val="Strong"/>
+          <w:rFonts w:hint="cs"/>
+          <w:sz w:val="24"/>
+          <w:szCs w:val="24"/>
+          <w:rtl/>
+        </w:rPr>
+      </w:pPr>
+    </w:p>
+    <w:p>
+      <w:pPr>
+        <w:pBdr>
+          <w:bottom w:val="single" w:sz="6" w:space="0" w:color="BFC3C8"/>
+        </w:pBdr>
+        <w:spacing w:before="120" w:after="120" w:line="0" w:lineRule="auto"/>
+        <w:jc w:val="right"/>
+        <w:rPr>
+          <w:rStyle w:val="Strong"/>
+          <w:rFonts w:hint="cs"/>
+          <w:sz w:val="24"/>
+          <w:szCs w:val="24"/>
+          <w:rtl/>
+        </w:rPr>
+      </w:pPr>
+    </w:p>
+    <w:p>
+      <w:pPr>
+        <w:pBdr>
+          <w:bottom w:val="single" w:sz="6" w:space="0" w:color="BFC3C8"/>
+        </w:pBdr>
+        <w:spacing w:before="120" w:after="120" w:line="0" w:lineRule="auto"/>
+        <w:jc w:val="right"/>
+        <w:rPr>
+          <w:rStyle w:val="Strong"/>
+          <w:sz w:val="24"/>
+          <w:szCs w:val="24"/>
+        </w:rPr>
+      </w:pPr>
+    </w:p>
+    <w:p>
+      <w:pPr>
+        <w:spacing w:before="120" w:after="120" w:line="336" w:lineRule="auto"/>
+        <w:ind w:left="360"/>
+        <w:jc w:val="right"/>
+        <w:rPr>
+          <w:rStyle w:val="Strong"/>
+          <w:sz w:val="28"/>
+          <w:szCs w:val="28"/>
+          <w:u w:val="single"/>
+        </w:rPr>
+      </w:pPr>
+      <w:r>
+        <w:rPr>
+          <w:rStyle w:val="Strong"/>
+          <w:sz w:val="28"/>
+          <w:szCs w:val="28"/>
+          <w:u w:val="single"/>
+          <w:rtl/>
+        </w:rPr>
+        <w:lastRenderedPageBreak/>
+        <w:t>الباقة المتقدمة</w:t>
+      </w:r>
+      <w:r>
+        <w:rPr>
+          <w:rStyle w:val="Strong"/>
+          <w:sz w:val="28"/>
+          <w:szCs w:val="28"/>
+          <w:u w:val="single"/>
+        </w:rPr>
+        <w:t xml:space="preserve"> (Premium) </w:t>
       </w:r>
     </w:p>
     <w:p>
@@ -833,207 +2329,11 @@
       <w:r>
         <w:rPr>
           <w:rStyle w:val="Strong"/>
-          <w:rFonts w:ascii="Calibri" w:hAnsi="Calibri" w:cs="Calibri"/>
-          <w:sz w:val="24"/>
-          <w:szCs w:val="24"/>
-        </w:rPr>
-        <w:t>💰</w:t>
-      </w:r>
-      <w:r>
-        <w:rPr>
-          <w:rStyle w:val="Strong"/>
-          <w:sz w:val="24"/>
-          <w:szCs w:val="24"/>
-        </w:rPr>
-        <w:t xml:space="preserve"> </w:t>
-      </w:r>
-      <w:r>
-        <w:rPr>
-          <w:rStyle w:val="Strong"/>
-          <w:sz w:val="24"/>
-          <w:szCs w:val="24"/>
-          <w:rtl/>
-        </w:rPr>
-        <w:t xml:space="preserve">السعر: </w:t>
-      </w:r>
-      <w:r>
-        <w:rPr>
-          <w:rStyle w:val="Strong"/>
-          <w:sz w:val="24"/>
-          <w:szCs w:val="24"/>
-          <w:rtl/>
-        </w:rPr>
-        <w:br/>
-      </w:r>
-      <w:r>
-        <w:rPr>
-          <w:rStyle w:val="Strong"/>
-          <w:sz w:val="24"/>
-          <w:szCs w:val="24"/>
-        </w:rPr>
-        <w:t>12,000</w:t>
-      </w:r>
-      <w:r>
-        <w:rPr>
-          <w:rStyle w:val="Strong"/>
-          <w:sz w:val="24"/>
-          <w:szCs w:val="24"/>
-        </w:rPr>
-        <w:br/>
-      </w:r>
-      <w:r>
-        <w:rPr>
-          <w:rStyle w:val="Strong"/>
-          <w:sz w:val="24"/>
-          <w:szCs w:val="24"/>
-          <w:rtl/>
-        </w:rPr>
-        <w:lastRenderedPageBreak/>
-        <w:t xml:space="preserve"> جنيه</w:t>
-      </w:r>
-      <w:r>
-        <w:rPr>
-          <w:rStyle w:val="Strong"/>
-          <w:rFonts w:ascii="Tahoma" w:hAnsi="Tahoma" w:cs="Tahoma" w:hint="cs"/>
-          <w:sz w:val="24"/>
-          <w:szCs w:val="24"/>
-          <w:rtl/>
-        </w:rPr>
-        <w:t> -</w:t>
-      </w:r>
-      <w:r>
-        <w:rPr>
-          <w:rStyle w:val="Strong"/>
-          <w:sz w:val="24"/>
-          <w:szCs w:val="24"/>
-          <w:rtl/>
-        </w:rPr>
-        <w:br/>
-      </w:r>
-      <w:r>
-        <w:rPr>
-          <w:rStyle w:val="Strong"/>
-          <w:rFonts w:ascii="Arial" w:hAnsi="Arial" w:cs="Arial" w:hint="cs"/>
-          <w:sz w:val="24"/>
-          <w:szCs w:val="24"/>
-          <w:rtl/>
-        </w:rPr>
-        <w:t>💳</w:t>
-      </w:r>
-      <w:r>
-        <w:rPr>
-          <w:rStyle w:val="Strong"/>
-          <w:sz w:val="24"/>
-          <w:szCs w:val="24"/>
-          <w:rtl/>
-        </w:rPr>
-        <w:t xml:space="preserve"> </w:t>
-      </w:r>
-      <w:r>
-        <w:rPr>
-          <w:rStyle w:val="Strong"/>
-          <w:rFonts w:ascii="Arial" w:hAnsi="Arial" w:cs="Arial" w:hint="cs"/>
-          <w:sz w:val="24"/>
-          <w:szCs w:val="24"/>
-          <w:rtl/>
-        </w:rPr>
-        <w:t>الرسوم</w:t>
-      </w:r>
-      <w:r>
-        <w:rPr>
-          <w:rStyle w:val="Strong"/>
-          <w:sz w:val="24"/>
-          <w:szCs w:val="24"/>
-          <w:rtl/>
-        </w:rPr>
-        <w:t xml:space="preserve"> </w:t>
-      </w:r>
-      <w:r>
-        <w:rPr>
-          <w:rStyle w:val="Strong"/>
-          <w:rFonts w:ascii="Arial" w:hAnsi="Arial" w:cs="Arial" w:hint="cs"/>
-          <w:sz w:val="24"/>
-          <w:szCs w:val="24"/>
-          <w:rtl/>
-        </w:rPr>
-        <w:t>الشهرية</w:t>
-      </w:r>
-      <w:r>
-        <w:rPr>
-          <w:rStyle w:val="Strong"/>
-          <w:sz w:val="24"/>
-          <w:szCs w:val="24"/>
-          <w:rtl/>
-        </w:rPr>
-        <w:t xml:space="preserve">: </w:t>
-      </w:r>
-      <w:r>
-        <w:rPr>
-          <w:rStyle w:val="Strong"/>
-          <w:sz w:val="24"/>
-          <w:szCs w:val="24"/>
-        </w:rPr>
-        <w:t>600</w:t>
-      </w:r>
-      <w:r>
-        <w:rPr>
-          <w:rStyle w:val="Strong"/>
-          <w:sz w:val="24"/>
-          <w:szCs w:val="24"/>
-          <w:rtl/>
-        </w:rPr>
-        <w:t xml:space="preserve"> جنيه (</w:t>
-      </w:r>
-      <w:r>
-        <w:rPr>
-          <w:rStyle w:val="Strong"/>
-          <w:sz w:val="24"/>
-          <w:szCs w:val="24"/>
-        </w:rPr>
-        <w:t>5</w:t>
-      </w:r>
-      <w:r>
-        <w:rPr>
-          <w:rStyle w:val="Strong"/>
-          <w:sz w:val="24"/>
-          <w:szCs w:val="24"/>
-          <w:rtl/>
-        </w:rPr>
-        <w:t>%)</w:t>
-      </w:r>
-      <w:r>
-        <w:rPr>
-          <w:rStyle w:val="Strong"/>
-          <w:sz w:val="24"/>
-          <w:szCs w:val="24"/>
-        </w:rPr>
-        <w:t xml:space="preserve"> </w:t>
-      </w:r>
-    </w:p>
-    <w:p>
-      <w:pPr>
-        <w:pStyle w:val="ListParagraph"/>
-        <w:numPr>
-          <w:ilvl w:val="0"/>
-          <w:numId w:val="12"/>
-        </w:numPr>
-        <w:spacing w:before="120" w:after="120" w:line="336" w:lineRule="auto"/>
-        <w:jc w:val="right"/>
-        <w:rPr>
-          <w:rStyle w:val="Strong"/>
-          <w:sz w:val="24"/>
-          <w:szCs w:val="24"/>
-        </w:rPr>
-      </w:pPr>
-      <w:r>
-        <w:rPr>
-          <w:rStyle w:val="Strong"/>
-          <w:sz w:val="24"/>
-          <w:szCs w:val="24"/>
-          <w:rtl/>
-        </w:rPr>
-        <w:t>تشمل الرسوم الشهرية</w:t>
+          <w:sz w:val="24"/>
+          <w:szCs w:val="24"/>
+          <w:rtl/>
+        </w:rPr>
+        <w:t>تشمل كل ما في الباقات السابقة بالإضافة إلى</w:t>
       </w:r>
       <w:r>
         <w:rPr>
@@ -1061,11 +2361,21 @@
       <w:r>
         <w:rPr>
           <w:rStyle w:val="Strong"/>
-          <w:sz w:val="24"/>
-          <w:szCs w:val="24"/>
-          <w:rtl/>
-        </w:rPr>
-        <w:t>الدومين والاستضافة</w:t>
+          <w:rFonts w:hint="cs"/>
+          <w:sz w:val="24"/>
+          <w:szCs w:val="24"/>
+          <w:rtl/>
+        </w:rPr>
+        <w:t>شاشات لنظام</w:t>
+      </w:r>
+      <w:r>
+        <w:rPr>
+          <w:rStyle w:val="Strong"/>
+          <w:sz w:val="24"/>
+          <w:szCs w:val="24"/>
+          <w:rtl/>
+        </w:rPr>
+        <w:t xml:space="preserve"> الحسابات المتكامل</w:t>
       </w:r>
       <w:r>
         <w:rPr>
@@ -1097,7 +2407,7 @@
           <w:szCs w:val="24"/>
           <w:rtl/>
         </w:rPr>
-        <w:t>إدخال بيانات الأطباء</w:t>
+        <w:t>تقارير محاسبية تفصيلية</w:t>
       </w:r>
       <w:r>
         <w:rPr>
@@ -1129,7 +2439,17 @@
           <w:szCs w:val="24"/>
           <w:rtl/>
         </w:rPr>
-        <w:t>الدعم الفني الأساسي</w:t>
+        <w:t>تجهيز ملفات</w:t>
+      </w:r>
+      <w:r>
+        <w:rPr>
+          <w:rStyle w:val="Strong"/>
+          <w:rFonts w:hint="cs"/>
+          <w:sz w:val="24"/>
+          <w:szCs w:val="24"/>
+          <w:rtl/>
+        </w:rPr>
+        <w:t xml:space="preserve"> اكسل للمطالبات</w:t>
       </w:r>
       <w:r>
         <w:rPr>
@@ -1161,7 +2481,7 @@
           <w:szCs w:val="24"/>
           <w:rtl/>
         </w:rPr>
-        <w:t>متابعة تشغيل النظام</w:t>
+        <w:t>نسخ احتياطي تلقائي للبيانات</w:t>
       </w:r>
       <w:r>
         <w:rPr>
@@ -1170,103 +2490,6 @@
           <w:szCs w:val="24"/>
         </w:rPr>
         <w:t xml:space="preserve"> </w:t>
-      </w:r>
-    </w:p>
-    <w:p>
-      <w:pPr>
-        <w:pBdr>
-          <w:bottom w:val="single" w:sz="6" w:space="0" w:color="BFC3C8"/>
-        </w:pBdr>
-        <w:spacing w:before="120" w:after="120" w:line="0" w:lineRule="auto"/>
-        <w:jc w:val="right"/>
-        <w:rPr>
-          <w:rStyle w:val="Strong"/>
-          <w:sz w:val="24"/>
-          <w:szCs w:val="24"/>
-        </w:rPr>
-      </w:pPr>
-    </w:p>
-    <w:p>
-      <w:pPr>
-        <w:pStyle w:val="ListParagraph"/>
-        <w:numPr>
-          <w:ilvl w:val="0"/>
-          <w:numId w:val="12"/>
-        </w:numPr>
-        <w:spacing w:before="120" w:after="120" w:line="336" w:lineRule="auto"/>
-        <w:jc w:val="right"/>
-        <w:rPr>
-          <w:rStyle w:val="Strong"/>
-          <w:sz w:val="24"/>
-          <w:szCs w:val="24"/>
-        </w:rPr>
-      </w:pPr>
-      <w:r>
-        <w:rPr>
-          <w:rStyle w:val="Strong"/>
-          <w:rFonts w:ascii="Calibri" w:hAnsi="Calibri" w:cs="Calibri"/>
-          <w:sz w:val="24"/>
-          <w:szCs w:val="24"/>
-        </w:rPr>
-        <w:t>🔵</w:t>
-      </w:r>
-      <w:r>
-        <w:rPr>
-          <w:rStyle w:val="Strong"/>
-          <w:sz w:val="24"/>
-          <w:szCs w:val="24"/>
-        </w:rPr>
-        <w:t xml:space="preserve"> </w:t>
-      </w:r>
-      <w:r>
-        <w:rPr>
-          <w:rStyle w:val="Strong"/>
-          <w:sz w:val="24"/>
-          <w:szCs w:val="24"/>
-          <w:rtl/>
-        </w:rPr>
-        <w:t>الباقة المتوسطة</w:t>
-      </w:r>
-      <w:r>
-        <w:rPr>
-          <w:rStyle w:val="Strong"/>
-          <w:sz w:val="24"/>
-          <w:szCs w:val="24"/>
-        </w:rPr>
-        <w:t xml:space="preserve"> (Standard) </w:t>
-      </w:r>
-    </w:p>
-    <w:p>
-      <w:pPr>
-        <w:pStyle w:val="ListParagraph"/>
-        <w:numPr>
-          <w:ilvl w:val="0"/>
-          <w:numId w:val="12"/>
-        </w:numPr>
-        <w:spacing w:before="120" w:after="120" w:line="336" w:lineRule="auto"/>
-        <w:jc w:val="right"/>
-        <w:rPr>
-          <w:rStyle w:val="Strong"/>
-          <w:sz w:val="24"/>
-          <w:szCs w:val="24"/>
-        </w:rPr>
-      </w:pPr>
-      <w:r>
-        <w:rPr>
-          <w:rStyle w:val="Strong"/>
-          <w:sz w:val="24"/>
-          <w:szCs w:val="24"/>
-          <w:rtl/>
-        </w:rPr>
-        <w:t>تشمل كل ما في الباقة الأساسية بالإضافة إلى</w:t>
-      </w:r>
-      <w:r>
-        <w:rPr>
-          <w:rStyle w:val="Strong"/>
-          <w:sz w:val="24"/>
-          <w:szCs w:val="24"/>
-        </w:rPr>
-        <w:t xml:space="preserve">: </w:t>
       </w:r>
     </w:p>
     <w:p>
@@ -1279,18 +2502,119 @@
         <w:jc w:val="right"/>
         <w:rPr>
           <w:rStyle w:val="Strong"/>
-          <w:sz w:val="24"/>
-          <w:szCs w:val="24"/>
-        </w:rPr>
-      </w:pPr>
-      <w:r>
-        <w:rPr>
-          <w:rStyle w:val="Strong"/>
-          <w:sz w:val="24"/>
-          <w:szCs w:val="24"/>
-          <w:rtl/>
-        </w:rPr>
-        <w:t>لوحة تحكم متقدمة للإدارة</w:t>
+          <w:rFonts w:hint="cs"/>
+          <w:sz w:val="24"/>
+          <w:szCs w:val="24"/>
+        </w:rPr>
+      </w:pPr>
+      <w:r>
+        <w:rPr>
+          <w:rStyle w:val="Strong"/>
+          <w:sz w:val="24"/>
+          <w:szCs w:val="24"/>
+          <w:rtl/>
+        </w:rPr>
+        <w:t>دعم فني أسرع ومميز</w:t>
+      </w:r>
+    </w:p>
+    <w:p>
+      <w:pPr>
+        <w:spacing w:after="0" w:line="336" w:lineRule="auto"/>
+        <w:jc w:val="right"/>
+        <w:rPr>
+          <w:rStyle w:val="Strong"/>
+          <w:rFonts w:hint="cs"/>
+          <w:sz w:val="24"/>
+          <w:szCs w:val="24"/>
+          <w:u w:val="single"/>
+        </w:rPr>
+      </w:pPr>
+      <w:r>
+        <w:rPr>
+          <w:rStyle w:val="Strong"/>
+          <w:rFonts w:cs="Arial"/>
+          <w:sz w:val="24"/>
+          <w:szCs w:val="24"/>
+          <w:u w:val="single"/>
+          <w:rtl/>
+        </w:rPr>
+        <w:t xml:space="preserve">السعر : </w:t>
+      </w:r>
+      <w:r>
+        <w:rPr>
+          <w:rStyle w:val="Strong"/>
+          <w:rFonts w:cs="Arial" w:hint="cs"/>
+          <w:sz w:val="24"/>
+          <w:szCs w:val="24"/>
+          <w:u w:val="single"/>
+          <w:rtl/>
+        </w:rPr>
+        <w:t>20</w:t>
+      </w:r>
+      <w:r>
+        <w:rPr>
+          <w:rStyle w:val="Strong"/>
+          <w:rFonts w:cs="Arial"/>
+          <w:sz w:val="24"/>
+          <w:szCs w:val="24"/>
+          <w:u w:val="single"/>
+          <w:rtl/>
+        </w:rPr>
+        <w:t>000 جنيه  + ( 5 % )</w:t>
+      </w:r>
+      <w:r>
+        <w:rPr>
+          <w:rStyle w:val="Strong"/>
+          <w:rFonts w:cs="Arial" w:hint="cs"/>
+          <w:sz w:val="24"/>
+          <w:szCs w:val="24"/>
+          <w:u w:val="single"/>
+          <w:rtl/>
+        </w:rPr>
+        <w:t xml:space="preserve"> 1000 </w:t>
+      </w:r>
+      <w:r>
+        <w:rPr>
+          <w:rStyle w:val="Strong"/>
+          <w:rFonts w:cs="Arial"/>
+          <w:sz w:val="24"/>
+          <w:szCs w:val="24"/>
+          <w:u w:val="single"/>
+          <w:rtl/>
+        </w:rPr>
+        <w:t xml:space="preserve"> جنيه رسوم </w:t>
+      </w:r>
+      <w:r>
+        <w:rPr>
+          <w:rStyle w:val="Strong"/>
+          <w:rFonts w:cs="Arial" w:hint="cs"/>
+          <w:sz w:val="24"/>
+          <w:szCs w:val="24"/>
+          <w:u w:val="single"/>
+          <w:rtl/>
+        </w:rPr>
+        <w:t>شهريا</w:t>
+      </w:r>
+    </w:p>
+    <w:p>
+      <w:pPr>
+        <w:spacing w:after="0" w:line="336" w:lineRule="auto"/>
+        <w:ind w:left="360"/>
+        <w:jc w:val="right"/>
+        <w:rPr>
+          <w:rStyle w:val="Strong"/>
+          <w:sz w:val="24"/>
+          <w:szCs w:val="24"/>
+        </w:rPr>
+      </w:pPr>
+      <w:r>
+        <w:rPr>
+          <w:rStyle w:val="Strong"/>
+          <w:sz w:val="24"/>
+          <w:szCs w:val="24"/>
+          <w:rtl/>
+        </w:rPr>
+        <w:t xml:space="preserve"> تشمل الرسوم الشهرية</w:t>
       </w:r>
       <w:r>
         <w:rPr>
@@ -1322,27 +2646,7 @@
           <w:szCs w:val="24"/>
           <w:rtl/>
         </w:rPr>
-        <w:t xml:space="preserve">تأكيد الحجز عبر </w:t>
-      </w:r>
-      <w:proofErr w:type="spellStart"/>
-      <w:r>
-        <w:rPr>
-          <w:rStyle w:val="Strong"/>
-          <w:sz w:val="24"/>
-          <w:szCs w:val="24"/>
-          <w:rtl/>
-        </w:rPr>
-        <w:t>الواتساب</w:t>
-      </w:r>
-      <w:proofErr w:type="spellEnd"/>
-      <w:r>
-        <w:rPr>
-          <w:rStyle w:val="Strong"/>
-          <w:sz w:val="24"/>
-          <w:szCs w:val="24"/>
-          <w:rtl/>
-        </w:rPr>
-        <w:t xml:space="preserve"> التلقائي</w:t>
+        <w:t>استضافة قوية ومحسنة</w:t>
       </w:r>
       <w:r>
         <w:rPr>
@@ -1374,7 +2678,7 @@
           <w:szCs w:val="24"/>
           <w:rtl/>
         </w:rPr>
-        <w:t>إدارة حالات الحجوزات (مؤكد، ملغي، مكتمل)</w:t>
+        <w:t>دعم فني مميز على مدار الساعة</w:t>
       </w:r>
       <w:r>
         <w:rPr>
@@ -1406,7 +2710,7 @@
           <w:szCs w:val="24"/>
           <w:rtl/>
         </w:rPr>
-        <w:t>تقارير أساسية للحجوزات</w:t>
+        <w:t>صيانة دورية شاملة</w:t>
       </w:r>
       <w:r>
         <w:rPr>
@@ -1415,234 +2719,6 @@
           <w:szCs w:val="24"/>
         </w:rPr>
         <w:t xml:space="preserve"> </w:t>
-      </w:r>
-    </w:p>
-    <w:p>
-      <w:pPr>
-        <w:pStyle w:val="ListParagraph"/>
-        <w:numPr>
-          <w:ilvl w:val="0"/>
-          <w:numId w:val="12"/>
-        </w:numPr>
-        <w:spacing w:before="120" w:after="120" w:line="336" w:lineRule="auto"/>
-        <w:jc w:val="right"/>
-        <w:rPr>
-          <w:rStyle w:val="Strong"/>
-          <w:sz w:val="24"/>
-          <w:szCs w:val="24"/>
-        </w:rPr>
-      </w:pPr>
-      <w:r>
-        <w:rPr>
-          <w:rStyle w:val="Strong"/>
-          <w:rFonts w:ascii="Calibri" w:hAnsi="Calibri" w:cs="Calibri"/>
-          <w:sz w:val="24"/>
-          <w:szCs w:val="24"/>
-        </w:rPr>
-        <w:t>💰</w:t>
-      </w:r>
-      <w:r>
-        <w:rPr>
-          <w:rStyle w:val="Strong"/>
-          <w:sz w:val="24"/>
-          <w:szCs w:val="24"/>
-        </w:rPr>
-        <w:t xml:space="preserve"> </w:t>
-      </w:r>
-      <w:r>
-        <w:rPr>
-          <w:rStyle w:val="Strong"/>
-          <w:sz w:val="24"/>
-          <w:szCs w:val="24"/>
-          <w:rtl/>
-        </w:rPr>
-        <w:t xml:space="preserve">السعر: </w:t>
-      </w:r>
-      <w:r>
-        <w:rPr>
-          <w:rStyle w:val="Strong"/>
-          <w:sz w:val="24"/>
-          <w:szCs w:val="24"/>
-          <w:rtl/>
-        </w:rPr>
-        <w:br/>
-      </w:r>
-      <w:r>
-        <w:rPr>
-          <w:rStyle w:val="Strong"/>
-          <w:sz w:val="24"/>
-          <w:szCs w:val="24"/>
-        </w:rPr>
-        <w:t>15,000</w:t>
-      </w:r>
-      <w:r>
-        <w:rPr>
-          <w:rStyle w:val="Strong"/>
-          <w:sz w:val="24"/>
-          <w:szCs w:val="24"/>
-        </w:rPr>
-        <w:br/>
-      </w:r>
-      <w:r>
-        <w:rPr>
-          <w:rStyle w:val="Strong"/>
-          <w:sz w:val="24"/>
-          <w:szCs w:val="24"/>
-          <w:rtl/>
-        </w:rPr>
-        <w:t xml:space="preserve"> جنيه</w:t>
-      </w:r>
-      <w:r>
-        <w:rPr>
-          <w:rStyle w:val="Strong"/>
-          <w:rFonts w:ascii="Tahoma" w:hAnsi="Tahoma" w:cs="Tahoma" w:hint="cs"/>
-          <w:sz w:val="24"/>
-          <w:szCs w:val="24"/>
-          <w:rtl/>
-        </w:rPr>
-        <w:t> -</w:t>
-      </w:r>
-      <w:r>
-        <w:rPr>
-          <w:rStyle w:val="Strong"/>
-          <w:sz w:val="24"/>
-          <w:szCs w:val="24"/>
-          <w:rtl/>
-        </w:rPr>
-        <w:br/>
-      </w:r>
-      <w:r>
-        <w:rPr>
-          <w:rStyle w:val="Strong"/>
-          <w:rFonts w:ascii="Arial" w:hAnsi="Arial" w:cs="Arial" w:hint="cs"/>
-          <w:sz w:val="24"/>
-          <w:szCs w:val="24"/>
-          <w:rtl/>
-        </w:rPr>
-        <w:t>💳</w:t>
-      </w:r>
-      <w:r>
-        <w:rPr>
-          <w:rStyle w:val="Strong"/>
-          <w:sz w:val="24"/>
-          <w:szCs w:val="24"/>
-          <w:rtl/>
-        </w:rPr>
-        <w:t xml:space="preserve"> </w:t>
-      </w:r>
-      <w:r>
-        <w:rPr>
-          <w:rStyle w:val="Strong"/>
-          <w:rFonts w:ascii="Arial" w:hAnsi="Arial" w:cs="Arial" w:hint="cs"/>
-          <w:sz w:val="24"/>
-          <w:szCs w:val="24"/>
-          <w:rtl/>
-        </w:rPr>
-        <w:t>الرسوم</w:t>
-      </w:r>
-      <w:r>
-        <w:rPr>
-          <w:rStyle w:val="Strong"/>
-          <w:sz w:val="24"/>
-          <w:szCs w:val="24"/>
-          <w:rtl/>
-        </w:rPr>
-        <w:t xml:space="preserve"> </w:t>
-      </w:r>
-      <w:r>
-        <w:rPr>
-          <w:rStyle w:val="Strong"/>
-          <w:rFonts w:ascii="Arial" w:hAnsi="Arial" w:cs="Arial" w:hint="cs"/>
-          <w:sz w:val="24"/>
-          <w:szCs w:val="24"/>
-          <w:rtl/>
-        </w:rPr>
-        <w:t>الشهرية</w:t>
-      </w:r>
-      <w:r>
-        <w:rPr>
-          <w:rStyle w:val="Strong"/>
-          <w:sz w:val="24"/>
-          <w:szCs w:val="24"/>
-          <w:rtl/>
-        </w:rPr>
-        <w:t xml:space="preserve">: </w:t>
-      </w:r>
-      <w:r>
-        <w:rPr>
-          <w:rStyle w:val="Strong"/>
-          <w:sz w:val="24"/>
-          <w:szCs w:val="24"/>
-        </w:rPr>
-        <w:t>750</w:t>
-      </w:r>
-      <w:r>
-        <w:rPr>
-          <w:rStyle w:val="Strong"/>
-          <w:sz w:val="24"/>
-          <w:szCs w:val="24"/>
-          <w:rtl/>
-        </w:rPr>
-        <w:t xml:space="preserve"> جنيه (</w:t>
-      </w:r>
-      <w:r>
-        <w:rPr>
-          <w:rStyle w:val="Strong"/>
-          <w:sz w:val="24"/>
-          <w:szCs w:val="24"/>
-        </w:rPr>
-        <w:t>5</w:t>
-      </w:r>
-      <w:r>
-        <w:rPr>
-          <w:rStyle w:val="Strong"/>
-          <w:sz w:val="24"/>
-          <w:szCs w:val="24"/>
-          <w:rtl/>
-        </w:rPr>
-        <w:t>%)</w:t>
-      </w:r>
-      <w:r>
-        <w:rPr>
-          <w:rStyle w:val="Strong"/>
-          <w:sz w:val="24"/>
-          <w:szCs w:val="24"/>
-        </w:rPr>
-        <w:t xml:space="preserve"> </w:t>
-      </w:r>
-    </w:p>
-    <w:p>
-      <w:pPr>
-        <w:pStyle w:val="ListParagraph"/>
-        <w:numPr>
-          <w:ilvl w:val="0"/>
-          <w:numId w:val="12"/>
-        </w:numPr>
-        <w:spacing w:before="120" w:after="120" w:line="336" w:lineRule="auto"/>
-        <w:jc w:val="right"/>
-        <w:rPr>
-          <w:rStyle w:val="Strong"/>
-          <w:sz w:val="24"/>
-          <w:szCs w:val="24"/>
-        </w:rPr>
-      </w:pPr>
-      <w:r>
-        <w:rPr>
-          <w:rStyle w:val="Strong"/>
-          <w:sz w:val="24"/>
-          <w:szCs w:val="24"/>
-          <w:rtl/>
-        </w:rPr>
-        <w:t>تشمل الرسوم الشهرية</w:t>
-      </w:r>
-      <w:r>
-        <w:rPr>
-          <w:rStyle w:val="Strong"/>
-          <w:sz w:val="24"/>
-          <w:szCs w:val="24"/>
-        </w:rPr>
-        <w:t xml:space="preserve">: </w:t>
       </w:r>
     </w:p>
     <w:p>
@@ -1666,71 +2742,7 @@
           <w:szCs w:val="24"/>
           <w:rtl/>
         </w:rPr>
-        <w:t>جميع مميزات الباقة الأساسية</w:t>
-      </w:r>
-      <w:r>
-        <w:rPr>
-          <w:rStyle w:val="Strong"/>
-          <w:sz w:val="24"/>
-          <w:szCs w:val="24"/>
-        </w:rPr>
-        <w:t xml:space="preserve"> </w:t>
-      </w:r>
-    </w:p>
-    <w:p>
-      <w:pPr>
-        <w:numPr>
-          <w:ilvl w:val="0"/>
-          <w:numId w:val="12"/>
-        </w:numPr>
-        <w:spacing w:after="0" w:line="336" w:lineRule="auto"/>
-        <w:jc w:val="right"/>
-        <w:rPr>
-          <w:rStyle w:val="Strong"/>
-          <w:sz w:val="24"/>
-          <w:szCs w:val="24"/>
-        </w:rPr>
-      </w:pPr>
-      <w:r>
-        <w:rPr>
-          <w:rStyle w:val="Strong"/>
-          <w:sz w:val="24"/>
-          <w:szCs w:val="24"/>
-          <w:rtl/>
-        </w:rPr>
-        <w:t>دعم فني محسن</w:t>
-      </w:r>
-      <w:r>
-        <w:rPr>
-          <w:rStyle w:val="Strong"/>
-          <w:sz w:val="24"/>
-          <w:szCs w:val="24"/>
-        </w:rPr>
-        <w:t xml:space="preserve"> </w:t>
-      </w:r>
-    </w:p>
-    <w:p>
-      <w:pPr>
-        <w:numPr>
-          <w:ilvl w:val="0"/>
-          <w:numId w:val="12"/>
-        </w:numPr>
-        <w:spacing w:after="0" w:line="336" w:lineRule="auto"/>
-        <w:jc w:val="right"/>
-        <w:rPr>
-          <w:rStyle w:val="Strong"/>
-          <w:sz w:val="24"/>
-          <w:szCs w:val="24"/>
-        </w:rPr>
-      </w:pPr>
-      <w:r>
-        <w:rPr>
-          <w:rStyle w:val="Strong"/>
-          <w:sz w:val="24"/>
-          <w:szCs w:val="24"/>
-          <w:rtl/>
-        </w:rPr>
-        <w:t>تحديثات دورية للنظام</w:t>
+        <w:t>تحديثات مجانية للمميزات</w:t>
       </w:r>
       <w:r>
         <w:rPr>
@@ -1750,638 +2762,12 @@
         <w:jc w:val="right"/>
         <w:rPr>
           <w:rStyle w:val="Strong"/>
-          <w:sz w:val="24"/>
-          <w:szCs w:val="24"/>
-        </w:rPr>
-      </w:pPr>
-    </w:p>
-    <w:p>
-      <w:pPr>
-        <w:pStyle w:val="ListParagraph"/>
-        <w:numPr>
-          <w:ilvl w:val="0"/>
-          <w:numId w:val="12"/>
-        </w:numPr>
-        <w:spacing w:before="120" w:after="120" w:line="336" w:lineRule="auto"/>
-        <w:jc w:val="right"/>
-        <w:rPr>
-          <w:rStyle w:val="Strong"/>
-          <w:sz w:val="24"/>
-          <w:szCs w:val="24"/>
-        </w:rPr>
-      </w:pPr>
-      <w:r>
-        <w:rPr>
-          <w:rStyle w:val="Strong"/>
-          <w:rFonts w:ascii="Calibri" w:hAnsi="Calibri" w:cs="Calibri"/>
-          <w:sz w:val="24"/>
-          <w:szCs w:val="24"/>
-        </w:rPr>
-        <w:t>🟣</w:t>
-      </w:r>
-      <w:r>
-        <w:rPr>
-          <w:rStyle w:val="Strong"/>
-          <w:sz w:val="24"/>
-          <w:szCs w:val="24"/>
-        </w:rPr>
-        <w:t xml:space="preserve"> </w:t>
-      </w:r>
-      <w:r>
-        <w:rPr>
-          <w:rStyle w:val="Strong"/>
-          <w:sz w:val="24"/>
-          <w:szCs w:val="24"/>
-          <w:rtl/>
-        </w:rPr>
-        <w:t>الباقة المتقدمة</w:t>
-      </w:r>
-      <w:r>
-        <w:rPr>
-          <w:rStyle w:val="Strong"/>
-          <w:sz w:val="24"/>
-          <w:szCs w:val="24"/>
-        </w:rPr>
-        <w:t xml:space="preserve"> (Premium) </w:t>
-      </w:r>
-    </w:p>
-    <w:p>
-      <w:pPr>
-        <w:pStyle w:val="ListParagraph"/>
-        <w:numPr>
-          <w:ilvl w:val="0"/>
-          <w:numId w:val="12"/>
-        </w:numPr>
-        <w:spacing w:before="120" w:after="120" w:line="336" w:lineRule="auto"/>
-        <w:jc w:val="right"/>
-        <w:rPr>
-          <w:rStyle w:val="Strong"/>
-          <w:sz w:val="24"/>
-          <w:szCs w:val="24"/>
-        </w:rPr>
-      </w:pPr>
-      <w:r>
-        <w:rPr>
-          <w:rStyle w:val="Strong"/>
-          <w:sz w:val="24"/>
-          <w:szCs w:val="24"/>
-          <w:rtl/>
-        </w:rPr>
-        <w:t>تشمل كل ما في الباقات السابقة بالإضافة إلى</w:t>
-      </w:r>
-      <w:r>
-        <w:rPr>
-          <w:rStyle w:val="Strong"/>
-          <w:sz w:val="24"/>
-          <w:szCs w:val="24"/>
-        </w:rPr>
-        <w:t xml:space="preserve">: </w:t>
-      </w:r>
-    </w:p>
-    <w:p>
-      <w:pPr>
-        <w:numPr>
-          <w:ilvl w:val="0"/>
-          <w:numId w:val="12"/>
-        </w:numPr>
-        <w:spacing w:after="0" w:line="336" w:lineRule="auto"/>
-        <w:jc w:val="right"/>
-        <w:rPr>
-          <w:rStyle w:val="Strong"/>
-          <w:sz w:val="24"/>
-          <w:szCs w:val="24"/>
-        </w:rPr>
-      </w:pPr>
-      <w:proofErr w:type="spellStart"/>
-      <w:r>
-        <w:rPr>
-          <w:rStyle w:val="Strong"/>
-          <w:sz w:val="24"/>
-          <w:szCs w:val="24"/>
-          <w:rtl/>
-        </w:rPr>
-        <w:t>مديول</w:t>
-      </w:r>
-      <w:proofErr w:type="spellEnd"/>
-      <w:r>
-        <w:rPr>
-          <w:rStyle w:val="Strong"/>
-          <w:sz w:val="24"/>
-          <w:szCs w:val="24"/>
-          <w:rtl/>
-        </w:rPr>
-        <w:t xml:space="preserve"> الحسابات المتكامل</w:t>
-      </w:r>
-      <w:r>
-        <w:rPr>
-          <w:rStyle w:val="Strong"/>
-          <w:sz w:val="24"/>
-          <w:szCs w:val="24"/>
-        </w:rPr>
-        <w:t xml:space="preserve"> </w:t>
-      </w:r>
-    </w:p>
-    <w:p>
-      <w:pPr>
-        <w:numPr>
-          <w:ilvl w:val="0"/>
-          <w:numId w:val="12"/>
-        </w:numPr>
-        <w:spacing w:after="0" w:line="336" w:lineRule="auto"/>
-        <w:jc w:val="right"/>
-        <w:rPr>
-          <w:rStyle w:val="Strong"/>
-          <w:sz w:val="24"/>
-          <w:szCs w:val="24"/>
-        </w:rPr>
-      </w:pPr>
-      <w:r>
-        <w:rPr>
-          <w:rStyle w:val="Strong"/>
-          <w:sz w:val="24"/>
-          <w:szCs w:val="24"/>
-          <w:rtl/>
-        </w:rPr>
-        <w:t>تقارير محاسبية تفصيلية</w:t>
-      </w:r>
-      <w:r>
-        <w:rPr>
-          <w:rStyle w:val="Strong"/>
-          <w:sz w:val="24"/>
-          <w:szCs w:val="24"/>
-        </w:rPr>
-        <w:t xml:space="preserve"> </w:t>
-      </w:r>
-    </w:p>
-    <w:p>
-      <w:pPr>
-        <w:numPr>
-          <w:ilvl w:val="0"/>
-          <w:numId w:val="12"/>
-        </w:numPr>
-        <w:spacing w:after="0" w:line="336" w:lineRule="auto"/>
-        <w:jc w:val="right"/>
-        <w:rPr>
-          <w:rStyle w:val="Strong"/>
-          <w:sz w:val="24"/>
-          <w:szCs w:val="24"/>
-        </w:rPr>
-      </w:pPr>
-      <w:r>
-        <w:rPr>
-          <w:rStyle w:val="Strong"/>
-          <w:sz w:val="24"/>
-          <w:szCs w:val="24"/>
-          <w:rtl/>
-        </w:rPr>
-        <w:t>تجهيز ملفات</w:t>
-      </w:r>
-      <w:r>
-        <w:rPr>
-          <w:rStyle w:val="Strong"/>
-          <w:sz w:val="24"/>
-          <w:szCs w:val="24"/>
-        </w:rPr>
-        <w:t xml:space="preserve"> Excel </w:t>
-      </w:r>
-      <w:r>
-        <w:rPr>
-          <w:rStyle w:val="Strong"/>
-          <w:sz w:val="24"/>
-          <w:szCs w:val="24"/>
-          <w:rtl/>
-        </w:rPr>
-        <w:t>للمطالبات</w:t>
-      </w:r>
-      <w:r>
-        <w:rPr>
-          <w:rStyle w:val="Strong"/>
-          <w:sz w:val="24"/>
-          <w:szCs w:val="24"/>
-        </w:rPr>
-        <w:t xml:space="preserve"> </w:t>
-      </w:r>
-    </w:p>
-    <w:p>
-      <w:pPr>
-        <w:numPr>
-          <w:ilvl w:val="0"/>
-          <w:numId w:val="12"/>
-        </w:numPr>
-        <w:spacing w:after="0" w:line="336" w:lineRule="auto"/>
-        <w:jc w:val="right"/>
-        <w:rPr>
-          <w:rStyle w:val="Strong"/>
-          <w:sz w:val="24"/>
-          <w:szCs w:val="24"/>
-        </w:rPr>
-      </w:pPr>
-      <w:r>
-        <w:rPr>
-          <w:rStyle w:val="Strong"/>
-          <w:sz w:val="24"/>
-          <w:szCs w:val="24"/>
-          <w:rtl/>
-        </w:rPr>
-        <w:t>نسخ احتياطي تلقائي للبيانات</w:t>
-      </w:r>
-      <w:r>
-        <w:rPr>
-          <w:rStyle w:val="Strong"/>
-          <w:sz w:val="24"/>
-          <w:szCs w:val="24"/>
-        </w:rPr>
-        <w:t xml:space="preserve"> </w:t>
-      </w:r>
-    </w:p>
-    <w:p>
-      <w:pPr>
-        <w:numPr>
-          <w:ilvl w:val="0"/>
-          <w:numId w:val="12"/>
-        </w:numPr>
-        <w:spacing w:after="0" w:line="336" w:lineRule="auto"/>
-        <w:jc w:val="right"/>
-        <w:rPr>
-          <w:rStyle w:val="Strong"/>
-          <w:sz w:val="24"/>
-          <w:szCs w:val="24"/>
-        </w:rPr>
-      </w:pPr>
-      <w:r>
-        <w:rPr>
-          <w:rStyle w:val="Strong"/>
-          <w:sz w:val="24"/>
-          <w:szCs w:val="24"/>
-          <w:rtl/>
-        </w:rPr>
-        <w:t>دعم فني أسرع ومميز</w:t>
-      </w:r>
-      <w:r>
-        <w:rPr>
-          <w:rStyle w:val="Strong"/>
-          <w:sz w:val="24"/>
-          <w:szCs w:val="24"/>
-        </w:rPr>
-        <w:t xml:space="preserve"> </w:t>
-      </w:r>
-    </w:p>
-    <w:p>
-      <w:pPr>
-        <w:pStyle w:val="ListParagraph"/>
-        <w:numPr>
-          <w:ilvl w:val="0"/>
-          <w:numId w:val="12"/>
-        </w:numPr>
-        <w:spacing w:before="120" w:after="120" w:line="336" w:lineRule="auto"/>
-        <w:jc w:val="right"/>
-        <w:rPr>
-          <w:rStyle w:val="Strong"/>
-          <w:sz w:val="24"/>
-          <w:szCs w:val="24"/>
-        </w:rPr>
-      </w:pPr>
-      <w:r>
-        <w:rPr>
-          <w:rStyle w:val="Strong"/>
-          <w:rFonts w:ascii="Calibri" w:hAnsi="Calibri" w:cs="Calibri"/>
-          <w:sz w:val="24"/>
-          <w:szCs w:val="24"/>
-        </w:rPr>
-        <w:t>💰</w:t>
-      </w:r>
-      <w:r>
-        <w:rPr>
-          <w:rStyle w:val="Strong"/>
-          <w:sz w:val="24"/>
-          <w:szCs w:val="24"/>
-        </w:rPr>
-        <w:t xml:space="preserve"> </w:t>
-      </w:r>
-      <w:r>
-        <w:rPr>
-          <w:rStyle w:val="Strong"/>
-          <w:sz w:val="24"/>
-          <w:szCs w:val="24"/>
-          <w:rtl/>
-        </w:rPr>
-        <w:t xml:space="preserve">السعر: </w:t>
-      </w:r>
-      <w:r>
-        <w:rPr>
-          <w:rStyle w:val="Strong"/>
-          <w:sz w:val="24"/>
-          <w:szCs w:val="24"/>
-          <w:rtl/>
-        </w:rPr>
-        <w:br/>
-      </w:r>
-      <w:r>
-        <w:rPr>
-          <w:rStyle w:val="Strong"/>
-          <w:sz w:val="24"/>
-          <w:szCs w:val="24"/>
-        </w:rPr>
-        <w:t>20,000</w:t>
-      </w:r>
-      <w:r>
-        <w:rPr>
-          <w:rStyle w:val="Strong"/>
-          <w:sz w:val="24"/>
-          <w:szCs w:val="24"/>
-        </w:rPr>
-        <w:br/>
-      </w:r>
-      <w:r>
-        <w:rPr>
-          <w:rStyle w:val="Strong"/>
-          <w:sz w:val="24"/>
-          <w:szCs w:val="24"/>
-          <w:rtl/>
-        </w:rPr>
-        <w:t xml:space="preserve"> جنيه</w:t>
-      </w:r>
-      <w:r>
-        <w:rPr>
-          <w:rStyle w:val="Strong"/>
-          <w:rFonts w:ascii="Tahoma" w:hAnsi="Tahoma" w:cs="Tahoma" w:hint="cs"/>
-          <w:sz w:val="24"/>
-          <w:szCs w:val="24"/>
-          <w:rtl/>
-        </w:rPr>
-        <w:t> -</w:t>
-      </w:r>
-      <w:r>
-        <w:rPr>
-          <w:rStyle w:val="Strong"/>
-          <w:sz w:val="24"/>
-          <w:szCs w:val="24"/>
-          <w:rtl/>
-        </w:rPr>
-        <w:br/>
-      </w:r>
-      <w:r>
-        <w:rPr>
-          <w:rStyle w:val="Strong"/>
-          <w:rFonts w:ascii="Arial" w:hAnsi="Arial" w:cs="Arial" w:hint="cs"/>
-          <w:sz w:val="24"/>
-          <w:szCs w:val="24"/>
-          <w:rtl/>
-        </w:rPr>
-        <w:t>💳</w:t>
-      </w:r>
-      <w:r>
-        <w:rPr>
-          <w:rStyle w:val="Strong"/>
-          <w:sz w:val="24"/>
-          <w:szCs w:val="24"/>
-          <w:rtl/>
-        </w:rPr>
-        <w:t xml:space="preserve"> </w:t>
-      </w:r>
-      <w:r>
-        <w:rPr>
-          <w:rStyle w:val="Strong"/>
-          <w:rFonts w:ascii="Arial" w:hAnsi="Arial" w:cs="Arial" w:hint="cs"/>
-          <w:sz w:val="24"/>
-          <w:szCs w:val="24"/>
-          <w:rtl/>
-        </w:rPr>
-        <w:t>الرسوم</w:t>
-      </w:r>
-      <w:r>
-        <w:rPr>
-          <w:rStyle w:val="Strong"/>
-          <w:sz w:val="24"/>
-          <w:szCs w:val="24"/>
-          <w:rtl/>
-        </w:rPr>
-        <w:t xml:space="preserve"> </w:t>
-      </w:r>
-      <w:r>
-        <w:rPr>
-          <w:rStyle w:val="Strong"/>
-          <w:rFonts w:ascii="Arial" w:hAnsi="Arial" w:cs="Arial" w:hint="cs"/>
-          <w:sz w:val="24"/>
-          <w:szCs w:val="24"/>
-          <w:rtl/>
-        </w:rPr>
-        <w:t>الشهرية</w:t>
-      </w:r>
-      <w:r>
-        <w:rPr>
-          <w:rStyle w:val="Strong"/>
-          <w:sz w:val="24"/>
-          <w:szCs w:val="24"/>
-          <w:rtl/>
-        </w:rPr>
-        <w:t xml:space="preserve">: </w:t>
-      </w:r>
-      <w:r>
-        <w:rPr>
-          <w:rStyle w:val="Strong"/>
-          <w:sz w:val="24"/>
-          <w:szCs w:val="24"/>
-        </w:rPr>
-        <w:t>1,000</w:t>
-      </w:r>
-      <w:r>
-        <w:rPr>
-          <w:rStyle w:val="Strong"/>
-          <w:sz w:val="24"/>
-          <w:szCs w:val="24"/>
-          <w:rtl/>
-        </w:rPr>
-        <w:t xml:space="preserve"> جنيه (</w:t>
-      </w:r>
-      <w:r>
-        <w:rPr>
-          <w:rStyle w:val="Strong"/>
-          <w:sz w:val="24"/>
-          <w:szCs w:val="24"/>
-        </w:rPr>
-        <w:t>5</w:t>
-      </w:r>
-      <w:r>
-        <w:rPr>
-          <w:rStyle w:val="Strong"/>
-          <w:sz w:val="24"/>
-          <w:szCs w:val="24"/>
-          <w:rtl/>
-        </w:rPr>
-        <w:t>%)</w:t>
-      </w:r>
-      <w:r>
-        <w:rPr>
-          <w:rStyle w:val="Strong"/>
-          <w:sz w:val="24"/>
-          <w:szCs w:val="24"/>
-        </w:rPr>
-        <w:t xml:space="preserve"> </w:t>
-      </w:r>
-    </w:p>
-    <w:p>
-      <w:pPr>
-        <w:pStyle w:val="ListParagraph"/>
-        <w:numPr>
-          <w:ilvl w:val="0"/>
-          <w:numId w:val="12"/>
-        </w:numPr>
-        <w:spacing w:before="120" w:after="120" w:line="336" w:lineRule="auto"/>
-        <w:jc w:val="right"/>
-        <w:rPr>
-          <w:rStyle w:val="Strong"/>
-          <w:sz w:val="24"/>
-          <w:szCs w:val="24"/>
-        </w:rPr>
-      </w:pPr>
-      <w:r>
-        <w:rPr>
-          <w:rStyle w:val="Strong"/>
-          <w:sz w:val="24"/>
-          <w:szCs w:val="24"/>
-          <w:rtl/>
-        </w:rPr>
-        <w:t>تشمل الرسوم الشهرية</w:t>
-      </w:r>
-      <w:r>
-        <w:rPr>
-          <w:rStyle w:val="Strong"/>
-          <w:sz w:val="24"/>
-          <w:szCs w:val="24"/>
-        </w:rPr>
-        <w:t xml:space="preserve">: </w:t>
-      </w:r>
-    </w:p>
-    <w:p>
-      <w:pPr>
-        <w:numPr>
-          <w:ilvl w:val="0"/>
-          <w:numId w:val="12"/>
-        </w:numPr>
-        <w:spacing w:after="0" w:line="336" w:lineRule="auto"/>
-        <w:jc w:val="right"/>
-        <w:rPr>
-          <w:rStyle w:val="Strong"/>
-          <w:sz w:val="24"/>
-          <w:szCs w:val="24"/>
-        </w:rPr>
-      </w:pPr>
-      <w:r>
-        <w:rPr>
-          <w:rStyle w:val="Strong"/>
-          <w:sz w:val="24"/>
-          <w:szCs w:val="24"/>
-          <w:rtl/>
-        </w:rPr>
-        <w:t>استضافة قوية ومحسنة</w:t>
-      </w:r>
-      <w:r>
-        <w:rPr>
-          <w:rStyle w:val="Strong"/>
-          <w:sz w:val="24"/>
-          <w:szCs w:val="24"/>
-        </w:rPr>
-        <w:t xml:space="preserve"> </w:t>
-      </w:r>
-    </w:p>
-    <w:p>
-      <w:pPr>
-        <w:numPr>
-          <w:ilvl w:val="0"/>
-          <w:numId w:val="12"/>
-        </w:numPr>
-        <w:spacing w:after="0" w:line="336" w:lineRule="auto"/>
-        <w:jc w:val="right"/>
-        <w:rPr>
-          <w:rStyle w:val="Strong"/>
-          <w:sz w:val="24"/>
-          <w:szCs w:val="24"/>
-        </w:rPr>
-      </w:pPr>
-      <w:r>
-        <w:rPr>
-          <w:rStyle w:val="Strong"/>
-          <w:sz w:val="24"/>
-          <w:szCs w:val="24"/>
-          <w:rtl/>
-        </w:rPr>
-        <w:t>دعم فني مميز على مدار الساعة</w:t>
-      </w:r>
-      <w:r>
-        <w:rPr>
-          <w:rStyle w:val="Strong"/>
-          <w:sz w:val="24"/>
-          <w:szCs w:val="24"/>
-        </w:rPr>
-        <w:t xml:space="preserve"> </w:t>
-      </w:r>
-    </w:p>
-    <w:p>
-      <w:pPr>
-        <w:numPr>
-          <w:ilvl w:val="0"/>
-          <w:numId w:val="12"/>
-        </w:numPr>
-        <w:spacing w:after="0" w:line="336" w:lineRule="auto"/>
-        <w:jc w:val="right"/>
-        <w:rPr>
-          <w:rStyle w:val="Strong"/>
-          <w:sz w:val="24"/>
-          <w:szCs w:val="24"/>
-        </w:rPr>
-      </w:pPr>
-      <w:r>
-        <w:rPr>
-          <w:rStyle w:val="Strong"/>
-          <w:sz w:val="24"/>
-          <w:szCs w:val="24"/>
-          <w:rtl/>
-        </w:rPr>
-        <w:lastRenderedPageBreak/>
-        <w:t>صيانة دورية شاملة</w:t>
-      </w:r>
-      <w:r>
-        <w:rPr>
-          <w:rStyle w:val="Strong"/>
-          <w:sz w:val="24"/>
-          <w:szCs w:val="24"/>
-        </w:rPr>
-        <w:t xml:space="preserve"> </w:t>
-      </w:r>
-    </w:p>
-    <w:p>
-      <w:pPr>
-        <w:numPr>
-          <w:ilvl w:val="0"/>
-          <w:numId w:val="12"/>
-        </w:numPr>
-        <w:spacing w:after="0" w:line="336" w:lineRule="auto"/>
-        <w:jc w:val="right"/>
-        <w:rPr>
-          <w:rStyle w:val="Strong"/>
-          <w:sz w:val="24"/>
-          <w:szCs w:val="24"/>
-        </w:rPr>
-      </w:pPr>
-      <w:r>
-        <w:rPr>
-          <w:rStyle w:val="Strong"/>
-          <w:sz w:val="24"/>
-          <w:szCs w:val="24"/>
-          <w:rtl/>
-        </w:rPr>
-        <w:t>تحديثات مجانية للمميزات</w:t>
-      </w:r>
-      <w:r>
-        <w:rPr>
-          <w:rStyle w:val="Strong"/>
-          <w:sz w:val="24"/>
-          <w:szCs w:val="24"/>
-        </w:rPr>
-        <w:t xml:space="preserve"> </w:t>
-      </w:r>
+          <w:rFonts w:hint="cs"/>
+          <w:sz w:val="24"/>
+          <w:szCs w:val="24"/>
+          <w:rtl/>
+        </w:rPr>
+      </w:pPr>
     </w:p>
     <w:p>
       <w:pPr>
@@ -2392,6 +2778,70 @@
         <w:jc w:val="right"/>
         <w:rPr>
           <w:rStyle w:val="Strong"/>
+          <w:rFonts w:hint="cs"/>
+          <w:sz w:val="24"/>
+          <w:szCs w:val="24"/>
+          <w:rtl/>
+        </w:rPr>
+      </w:pPr>
+    </w:p>
+    <w:p>
+      <w:pPr>
+        <w:pBdr>
+          <w:bottom w:val="single" w:sz="6" w:space="0" w:color="BFC3C8"/>
+        </w:pBdr>
+        <w:spacing w:before="120" w:after="120" w:line="0" w:lineRule="auto"/>
+        <w:jc w:val="right"/>
+        <w:rPr>
+          <w:rStyle w:val="Strong"/>
+          <w:rFonts w:hint="cs"/>
+          <w:sz w:val="24"/>
+          <w:szCs w:val="24"/>
+          <w:rtl/>
+        </w:rPr>
+      </w:pPr>
+    </w:p>
+    <w:p>
+      <w:pPr>
+        <w:pBdr>
+          <w:bottom w:val="single" w:sz="6" w:space="0" w:color="BFC3C8"/>
+        </w:pBdr>
+        <w:spacing w:before="120" w:after="120" w:line="0" w:lineRule="auto"/>
+        <w:jc w:val="right"/>
+        <w:rPr>
+          <w:rStyle w:val="Strong"/>
+          <w:rFonts w:hint="cs"/>
+          <w:sz w:val="24"/>
+          <w:szCs w:val="24"/>
+          <w:rtl/>
+        </w:rPr>
+      </w:pPr>
+    </w:p>
+    <w:p>
+      <w:pPr>
+        <w:pBdr>
+          <w:bottom w:val="single" w:sz="6" w:space="0" w:color="BFC3C8"/>
+        </w:pBdr>
+        <w:spacing w:before="120" w:after="120" w:line="0" w:lineRule="auto"/>
+        <w:jc w:val="right"/>
+        <w:rPr>
+          <w:rStyle w:val="Strong"/>
+          <w:rFonts w:hint="cs"/>
+          <w:sz w:val="24"/>
+          <w:szCs w:val="24"/>
+          <w:rtl/>
+        </w:rPr>
+      </w:pPr>
+    </w:p>
+    <w:p>
+      <w:pPr>
+        <w:pBdr>
+          <w:bottom w:val="single" w:sz="6" w:space="0" w:color="BFC3C8"/>
+        </w:pBdr>
+        <w:spacing w:before="120" w:after="120" w:line="0" w:lineRule="auto"/>
+        <w:jc w:val="right"/>
+        <w:rPr>
+          <w:rStyle w:val="Strong"/>
           <w:sz w:val="24"/>
           <w:szCs w:val="24"/>
         </w:rPr>
@@ -2405,84 +2855,68 @@
           <w:rStyle w:val="Strong"/>
           <w:sz w:val="24"/>
           <w:szCs w:val="24"/>
-        </w:rPr>
-      </w:pPr>
-      <w:r>
-        <w:rPr>
-          <w:rStyle w:val="Strong"/>
-          <w:sz w:val="24"/>
-          <w:szCs w:val="24"/>
-          <w:rtl/>
-        </w:rPr>
-        <w:t>مدة التنفيذ</w:t>
-      </w:r>
-      <w:r>
-        <w:rPr>
-          <w:rStyle w:val="Strong"/>
-          <w:sz w:val="24"/>
-          <w:szCs w:val="24"/>
-        </w:rPr>
-        <w:t xml:space="preserve"> </w:t>
-      </w:r>
-    </w:p>
-    <w:p>
-      <w:pPr>
-        <w:spacing w:before="120" w:after="120" w:line="336" w:lineRule="auto"/>
-        <w:jc w:val="right"/>
-        <w:rPr>
-          <w:rStyle w:val="Strong"/>
-          <w:sz w:val="24"/>
-          <w:szCs w:val="24"/>
+          <w:u w:val="single"/>
+        </w:rPr>
+      </w:pPr>
+      <w:r>
+        <w:rPr>
+          <w:rStyle w:val="Strong"/>
+          <w:sz w:val="24"/>
+          <w:szCs w:val="24"/>
+          <w:u w:val="single"/>
+          <w:rtl/>
+        </w:rPr>
+        <w:t>مدة التنفي</w:t>
+      </w:r>
+      <w:r>
+        <w:rPr>
+          <w:rStyle w:val="Strong"/>
+          <w:rFonts w:hint="cs"/>
+          <w:sz w:val="24"/>
+          <w:szCs w:val="24"/>
+          <w:u w:val="single"/>
+          <w:rtl/>
+        </w:rPr>
+        <w:t xml:space="preserve">ذ : </w:t>
+      </w:r>
+      <w:r>
+        <w:rPr>
+          <w:rStyle w:val="Strong"/>
+          <w:rFonts w:hint="cs"/>
+          <w:sz w:val="24"/>
+          <w:szCs w:val="24"/>
+          <w:u w:val="single"/>
           <w:rtl/>
           <w:lang w:bidi="ar-EG"/>
         </w:rPr>
-      </w:pPr>
-      <w:r>
-        <w:rPr>
-          <w:rStyle w:val="Strong"/>
-          <w:rFonts w:hint="cs"/>
-          <w:sz w:val="24"/>
-          <w:szCs w:val="24"/>
+        <w:t xml:space="preserve">حسب </w:t>
+      </w:r>
+      <w:proofErr w:type="spellStart"/>
+      <w:r>
+        <w:rPr>
+          <w:rStyle w:val="Strong"/>
+          <w:rFonts w:hint="cs"/>
+          <w:sz w:val="24"/>
+          <w:szCs w:val="24"/>
+          <w:u w:val="single"/>
           <w:rtl/>
           <w:lang w:bidi="ar-EG"/>
         </w:rPr>
-        <w:t xml:space="preserve">حسب </w:t>
-      </w:r>
-      <w:proofErr w:type="spellStart"/>
-      <w:r>
-        <w:rPr>
-          <w:rStyle w:val="Strong"/>
-          <w:rFonts w:hint="cs"/>
-          <w:sz w:val="24"/>
-          <w:szCs w:val="24"/>
+        <w:t>الباقه</w:t>
+      </w:r>
+      <w:proofErr w:type="spellEnd"/>
+      <w:r>
+        <w:rPr>
+          <w:rStyle w:val="Strong"/>
+          <w:rFonts w:hint="cs"/>
+          <w:sz w:val="24"/>
+          <w:szCs w:val="24"/>
+          <w:u w:val="single"/>
           <w:rtl/>
           <w:lang w:bidi="ar-EG"/>
         </w:rPr>
-        <w:t>الباقه</w:t>
-      </w:r>
-      <w:proofErr w:type="spellEnd"/>
-      <w:r>
-        <w:rPr>
-          <w:rStyle w:val="Strong"/>
-          <w:rFonts w:hint="cs"/>
-          <w:sz w:val="24"/>
-          <w:szCs w:val="24"/>
-          <w:rtl/>
-          <w:lang w:bidi="ar-EG"/>
-        </w:rPr>
         <w:t xml:space="preserve"> المتفق عليها</w:t>
       </w:r>
-    </w:p>
-    <w:p>
-      <w:pPr>
-        <w:spacing w:before="120" w:after="120" w:line="336" w:lineRule="auto"/>
-        <w:jc w:val="right"/>
-        <w:rPr>
-          <w:rStyle w:val="Strong"/>
-          <w:sz w:val="24"/>
-          <w:szCs w:val="24"/>
-        </w:rPr>
-      </w:pPr>
     </w:p>
     <w:p>
       <w:pPr>
@@ -2566,8 +3000,8 @@
     </w:p>
     <w:p>
       <w:pPr>
+        <w:bidi/>
         <w:spacing w:before="120" w:after="120" w:line="336" w:lineRule="auto"/>
-        <w:jc w:val="right"/>
         <w:rPr>
           <w:rStyle w:val="Strong"/>
           <w:sz w:val="24"/>
@@ -2598,8 +3032,8 @@
           <w:ilvl w:val="0"/>
           <w:numId w:val="9"/>
         </w:numPr>
+        <w:bidi/>
         <w:spacing w:after="0" w:line="336" w:lineRule="auto"/>
-        <w:jc w:val="right"/>
         <w:rPr>
           <w:rStyle w:val="Strong"/>
           <w:sz w:val="24"/>
@@ -2665,8 +3099,8 @@
           <w:ilvl w:val="0"/>
           <w:numId w:val="9"/>
         </w:numPr>
+        <w:bidi/>
         <w:spacing w:after="0" w:line="336" w:lineRule="auto"/>
-        <w:jc w:val="right"/>
         <w:rPr>
           <w:rStyle w:val="Strong"/>
           <w:sz w:val="24"/>
@@ -2697,8 +3131,8 @@
           <w:ilvl w:val="0"/>
           <w:numId w:val="9"/>
         </w:numPr>
+        <w:bidi/>
         <w:spacing w:after="0" w:line="336" w:lineRule="auto"/>
-        <w:jc w:val="right"/>
         <w:rPr>
           <w:rStyle w:val="Strong"/>
           <w:sz w:val="24"/>
@@ -2738,6 +3172,7 @@
           <w:rStyle w:val="Strong"/>
           <w:sz w:val="24"/>
           <w:szCs w:val="24"/>
+          <w:u w:val="single"/>
           <w:rtl/>
         </w:rPr>
         <w:t>شروط التعاقد</w:t>
@@ -2757,8 +3192,8 @@
           <w:ilvl w:val="0"/>
           <w:numId w:val="10"/>
         </w:numPr>
+        <w:bidi/>
         <w:spacing w:after="0" w:line="336" w:lineRule="auto"/>
-        <w:jc w:val="right"/>
         <w:rPr>
           <w:rStyle w:val="Strong"/>
           <w:sz w:val="24"/>
@@ -2789,8 +3224,8 @@
           <w:ilvl w:val="0"/>
           <w:numId w:val="10"/>
         </w:numPr>
+        <w:bidi/>
         <w:spacing w:after="0" w:line="336" w:lineRule="auto"/>
-        <w:jc w:val="right"/>
         <w:rPr>
           <w:rStyle w:val="Strong"/>
           <w:sz w:val="24"/>
@@ -2821,8 +3256,8 @@
           <w:ilvl w:val="0"/>
           <w:numId w:val="10"/>
         </w:numPr>
+        <w:bidi/>
         <w:spacing w:after="0" w:line="336" w:lineRule="auto"/>
-        <w:jc w:val="right"/>
         <w:rPr>
           <w:rStyle w:val="Strong"/>
           <w:sz w:val="24"/>
@@ -2853,8 +3288,8 @@
           <w:ilvl w:val="0"/>
           <w:numId w:val="10"/>
         </w:numPr>
+        <w:bidi/>
         <w:spacing w:after="0" w:line="336" w:lineRule="auto"/>
-        <w:jc w:val="right"/>
         <w:rPr>
           <w:rStyle w:val="Strong"/>
           <w:sz w:val="24"/>
@@ -2902,8 +3337,8 @@
           <w:ilvl w:val="0"/>
           <w:numId w:val="10"/>
         </w:numPr>
+        <w:bidi/>
         <w:spacing w:after="0" w:line="336" w:lineRule="auto"/>
-        <w:jc w:val="right"/>
         <w:rPr>
           <w:rStyle w:val="Strong"/>
           <w:sz w:val="24"/>
@@ -3000,8 +3435,8 @@
     </w:p>
     <w:p>
       <w:pPr>
+        <w:bidi/>
         <w:spacing w:before="120" w:after="120" w:line="336" w:lineRule="auto"/>
-        <w:jc w:val="right"/>
         <w:rPr>
           <w:rStyle w:val="Strong"/>
           <w:sz w:val="24"/>
@@ -3017,19 +3452,11 @@
         </w:rPr>
         <w:t>التوقيعات</w:t>
       </w:r>
-      <w:r>
-        <w:rPr>
-          <w:rStyle w:val="Strong"/>
-          <w:sz w:val="24"/>
-          <w:szCs w:val="24"/>
-        </w:rPr>
-        <w:t xml:space="preserve"> </w:t>
-      </w:r>
-    </w:p>
-    <w:p>
-      <w:pPr>
+    </w:p>
+    <w:p>
+      <w:pPr>
+        <w:bidi/>
         <w:spacing w:before="120" w:after="120" w:line="336" w:lineRule="auto"/>
-        <w:jc w:val="right"/>
         <w:rPr>
           <w:rStyle w:val="Strong"/>
           <w:sz w:val="24"/>
@@ -3051,27 +3478,50 @@
           <w:sz w:val="24"/>
           <w:szCs w:val="24"/>
         </w:rPr>
-        <w:t xml:space="preserve">: ___________________ </w:t>
-      </w:r>
-    </w:p>
-    <w:p>
-      <w:pPr>
+        <w:t>__________________</w:t>
+      </w:r>
+    </w:p>
+    <w:p>
+      <w:pPr>
+        <w:bidi/>
         <w:spacing w:before="120" w:after="120" w:line="336" w:lineRule="auto"/>
-        <w:jc w:val="right"/>
-        <w:rPr>
-          <w:rStyle w:val="Strong"/>
-          <w:sz w:val="24"/>
-          <w:szCs w:val="24"/>
-        </w:rPr>
-      </w:pPr>
-      <w:r>
-        <w:rPr>
-          <w:rStyle w:val="Strong"/>
-          <w:sz w:val="24"/>
-          <w:szCs w:val="24"/>
-          <w:rtl/>
-        </w:rPr>
-        <w:t>توقيع المطور: ___________________</w:t>
+        <w:rPr>
+          <w:rStyle w:val="Strong"/>
+          <w:rFonts w:hint="cs"/>
+          <w:sz w:val="24"/>
+          <w:szCs w:val="24"/>
+          <w:rtl/>
+          <w:lang w:bidi="ar-EG"/>
+        </w:rPr>
+      </w:pPr>
+      <w:r>
+        <w:rPr>
+          <w:rStyle w:val="Strong"/>
+          <w:sz w:val="24"/>
+          <w:szCs w:val="24"/>
+          <w:rtl/>
+        </w:rPr>
+        <w:t xml:space="preserve">توقيع المطور: </w:t>
+      </w:r>
+      <w:r>
+        <w:rPr>
+          <w:rStyle w:val="Strong"/>
+          <w:rFonts w:hint="cs"/>
+          <w:sz w:val="24"/>
+          <w:szCs w:val="24"/>
+          <w:rtl/>
+        </w:rPr>
+        <w:t xml:space="preserve">               </w:t>
+      </w:r>
+      <w:r>
+        <w:rPr>
+          <w:rStyle w:val="Strong"/>
+          <w:rFonts w:cs="Bold Italic Art" w:hint="cs"/>
+          <w:sz w:val="24"/>
+          <w:szCs w:val="24"/>
+          <w:rtl/>
+        </w:rPr>
+        <w:t>أحمد خالد عامر</w:t>
       </w:r>
       <w:r>
         <w:rPr>
@@ -3089,375 +3539,20 @@
           <w:sz w:val="24"/>
           <w:szCs w:val="24"/>
         </w:rPr>
-        <w:t xml:space="preserve">: ___________________ </w:t>
-      </w:r>
-    </w:p>
-    <w:p>
-      <w:pPr>
-        <w:pBdr>
-          <w:bottom w:val="single" w:sz="6" w:space="0" w:color="BFC3C8"/>
-        </w:pBdr>
-        <w:spacing w:before="120" w:after="120" w:line="0" w:lineRule="auto"/>
-        <w:jc w:val="right"/>
-        <w:rPr>
-          <w:rStyle w:val="Strong"/>
-          <w:sz w:val="24"/>
-          <w:szCs w:val="24"/>
-        </w:rPr>
-      </w:pPr>
-    </w:p>
-    <w:p>
-      <w:pPr>
-        <w:spacing w:before="120" w:after="120" w:line="336" w:lineRule="auto"/>
-        <w:jc w:val="right"/>
-        <w:rPr>
-          <w:rStyle w:val="Strong"/>
-          <w:sz w:val="24"/>
-          <w:szCs w:val="24"/>
-        </w:rPr>
-      </w:pPr>
-      <w:r>
-        <w:rPr>
-          <w:rStyle w:val="Strong"/>
-          <w:sz w:val="24"/>
-          <w:szCs w:val="24"/>
-          <w:rtl/>
-        </w:rPr>
-        <w:t xml:space="preserve">هذا العرض صالح لمدة </w:t>
-      </w:r>
-      <w:r>
-        <w:rPr>
-          <w:rStyle w:val="Strong"/>
-          <w:sz w:val="24"/>
-          <w:szCs w:val="24"/>
-        </w:rPr>
-        <w:t>30</w:t>
-      </w:r>
-      <w:r>
-        <w:rPr>
-          <w:rStyle w:val="Strong"/>
-          <w:sz w:val="24"/>
-          <w:szCs w:val="24"/>
-          <w:rtl/>
-        </w:rPr>
-        <w:t xml:space="preserve"> يوماً من تاريخ الإصدار</w:t>
-      </w:r>
-      <w:r>
-        <w:rPr>
-          <w:rStyle w:val="Strong"/>
-          <w:sz w:val="24"/>
-          <w:szCs w:val="24"/>
-        </w:rPr>
-        <w:t xml:space="preserve"> </w:t>
-      </w:r>
-    </w:p>
-    <w:p>
-      <w:pPr>
-        <w:spacing w:before="120" w:after="120" w:line="336" w:lineRule="auto"/>
-        <w:jc w:val="right"/>
-        <w:rPr>
-          <w:rStyle w:val="Strong"/>
-          <w:sz w:val="24"/>
-          <w:szCs w:val="24"/>
-        </w:rPr>
-      </w:pPr>
-      <w:r>
-        <w:rPr>
-          <w:rStyle w:val="Strong"/>
-          <w:sz w:val="24"/>
-          <w:szCs w:val="24"/>
-          <w:rtl/>
-        </w:rPr>
-        <w:t>للاستفسارات والتواصل:</w:t>
-      </w:r>
-      <w:r>
-        <w:rPr>
-          <w:rStyle w:val="Strong"/>
-          <w:sz w:val="24"/>
-          <w:szCs w:val="24"/>
-          <w:rtl/>
-        </w:rPr>
-        <w:br/>
-      </w:r>
-      <w:r>
-        <w:rPr>
-          <w:rStyle w:val="Strong"/>
-          <w:rFonts w:ascii="Arial" w:hAnsi="Arial" w:cs="Arial" w:hint="cs"/>
-          <w:sz w:val="24"/>
-          <w:szCs w:val="24"/>
-          <w:rtl/>
-        </w:rPr>
-        <w:t>أحمد</w:t>
-      </w:r>
-      <w:r>
-        <w:rPr>
-          <w:rStyle w:val="Strong"/>
-          <w:sz w:val="24"/>
-          <w:szCs w:val="24"/>
-          <w:rtl/>
-        </w:rPr>
-        <w:t xml:space="preserve"> </w:t>
-      </w:r>
-      <w:r>
-        <w:rPr>
-          <w:rStyle w:val="Strong"/>
-          <w:rFonts w:ascii="Arial" w:hAnsi="Arial" w:cs="Arial" w:hint="cs"/>
-          <w:sz w:val="24"/>
-          <w:szCs w:val="24"/>
-          <w:rtl/>
-        </w:rPr>
-        <w:t>خالد</w:t>
-      </w:r>
-      <w:r>
-        <w:rPr>
-          <w:rStyle w:val="Strong"/>
-          <w:sz w:val="24"/>
-          <w:szCs w:val="24"/>
-          <w:rtl/>
-        </w:rPr>
-        <w:t xml:space="preserve"> - </w:t>
-      </w:r>
-      <w:r>
-        <w:rPr>
-          <w:rStyle w:val="Strong"/>
-          <w:rFonts w:ascii="Arial" w:hAnsi="Arial" w:cs="Arial" w:hint="cs"/>
-          <w:sz w:val="24"/>
-          <w:szCs w:val="24"/>
-          <w:rtl/>
-        </w:rPr>
-        <w:t>مطور</w:t>
-      </w:r>
-      <w:r>
-        <w:rPr>
-          <w:rStyle w:val="Strong"/>
-          <w:sz w:val="24"/>
-          <w:szCs w:val="24"/>
-          <w:rtl/>
-        </w:rPr>
-        <w:t xml:space="preserve"> </w:t>
-      </w:r>
-      <w:r>
-        <w:rPr>
-          <w:rStyle w:val="Strong"/>
-          <w:rFonts w:ascii="Arial" w:hAnsi="Arial" w:cs="Arial" w:hint="cs"/>
-          <w:sz w:val="24"/>
-          <w:szCs w:val="24"/>
-          <w:rtl/>
-        </w:rPr>
-        <w:t>البرمجيات</w:t>
-      </w:r>
-      <w:r>
-        <w:rPr>
-          <w:rStyle w:val="Strong"/>
-          <w:sz w:val="24"/>
-          <w:szCs w:val="24"/>
-          <w:rtl/>
-        </w:rPr>
-        <w:br/>
-      </w:r>
-      <w:r>
-        <w:rPr>
-          <w:rStyle w:val="Strong"/>
-          <w:rFonts w:ascii="Arial" w:hAnsi="Arial" w:cs="Arial" w:hint="cs"/>
-          <w:sz w:val="24"/>
-          <w:szCs w:val="24"/>
-          <w:rtl/>
-        </w:rPr>
-        <w:t>📧</w:t>
-      </w:r>
-      <w:r>
-        <w:rPr>
-          <w:rStyle w:val="Strong"/>
-          <w:sz w:val="24"/>
-          <w:szCs w:val="24"/>
-          <w:rtl/>
-        </w:rPr>
-        <w:t xml:space="preserve"> </w:t>
-      </w:r>
-      <w:r>
-        <w:rPr>
-          <w:rStyle w:val="Strong"/>
-          <w:rFonts w:ascii="Arial" w:hAnsi="Arial" w:cs="Arial" w:hint="cs"/>
-          <w:sz w:val="24"/>
-          <w:szCs w:val="24"/>
-          <w:rtl/>
-        </w:rPr>
-        <w:t>البريد</w:t>
-      </w:r>
-      <w:r>
-        <w:rPr>
-          <w:rStyle w:val="Strong"/>
-          <w:sz w:val="24"/>
-          <w:szCs w:val="24"/>
-          <w:rtl/>
-        </w:rPr>
-        <w:t xml:space="preserve"> </w:t>
-      </w:r>
-      <w:r>
-        <w:rPr>
-          <w:rStyle w:val="Strong"/>
-          <w:rFonts w:ascii="Arial" w:hAnsi="Arial" w:cs="Arial" w:hint="cs"/>
-          <w:sz w:val="24"/>
-          <w:szCs w:val="24"/>
-          <w:rtl/>
-        </w:rPr>
-        <w:t>الإلكتروني</w:t>
-      </w:r>
-      <w:r>
-        <w:rPr>
-          <w:rStyle w:val="Strong"/>
-          <w:sz w:val="24"/>
-          <w:szCs w:val="24"/>
-          <w:rtl/>
-        </w:rPr>
-        <w:t>: [</w:t>
-      </w:r>
-      <w:r>
-        <w:rPr>
-          <w:rStyle w:val="Strong"/>
-          <w:rFonts w:ascii="Arial" w:hAnsi="Arial" w:cs="Arial" w:hint="cs"/>
-          <w:sz w:val="24"/>
-          <w:szCs w:val="24"/>
-          <w:rtl/>
-        </w:rPr>
-        <w:t>البريد</w:t>
-      </w:r>
-      <w:r>
-        <w:rPr>
-          <w:rStyle w:val="Strong"/>
-          <w:sz w:val="24"/>
-          <w:szCs w:val="24"/>
-          <w:rtl/>
-        </w:rPr>
-        <w:t xml:space="preserve"> </w:t>
-      </w:r>
-      <w:r>
-        <w:rPr>
-          <w:rStyle w:val="Strong"/>
-          <w:rFonts w:ascii="Arial" w:hAnsi="Arial" w:cs="Arial" w:hint="cs"/>
-          <w:sz w:val="24"/>
-          <w:szCs w:val="24"/>
-          <w:rtl/>
-        </w:rPr>
-        <w:t>الإلكتروني</w:t>
-      </w:r>
-      <w:r>
-        <w:rPr>
-          <w:rStyle w:val="Strong"/>
-          <w:sz w:val="24"/>
-          <w:szCs w:val="24"/>
-          <w:rtl/>
-        </w:rPr>
-        <w:t>]</w:t>
-      </w:r>
-      <w:r>
-        <w:rPr>
-          <w:rStyle w:val="Strong"/>
-          <w:rFonts w:ascii="Tahoma" w:hAnsi="Tahoma" w:cs="Tahoma" w:hint="cs"/>
-          <w:sz w:val="24"/>
-          <w:szCs w:val="24"/>
-          <w:rtl/>
-        </w:rPr>
-        <w:t> -</w:t>
-      </w:r>
-      <w:r>
-        <w:rPr>
-          <w:rStyle w:val="Strong"/>
-          <w:sz w:val="24"/>
-          <w:szCs w:val="24"/>
-          <w:rtl/>
-        </w:rPr>
-        <w:br/>
-      </w:r>
-      <w:r>
-        <w:rPr>
-          <w:rStyle w:val="Strong"/>
-          <w:rFonts w:ascii="Arial" w:hAnsi="Arial" w:cs="Arial" w:hint="cs"/>
-          <w:sz w:val="24"/>
-          <w:szCs w:val="24"/>
-          <w:rtl/>
-        </w:rPr>
-        <w:t>📱</w:t>
-      </w:r>
-      <w:r>
-        <w:rPr>
-          <w:rStyle w:val="Strong"/>
-          <w:sz w:val="24"/>
-          <w:szCs w:val="24"/>
-          <w:rtl/>
-        </w:rPr>
-        <w:t xml:space="preserve"> </w:t>
-      </w:r>
-      <w:r>
-        <w:rPr>
-          <w:rStyle w:val="Strong"/>
-          <w:rFonts w:ascii="Arial" w:hAnsi="Arial" w:cs="Arial" w:hint="cs"/>
-          <w:sz w:val="24"/>
-          <w:szCs w:val="24"/>
-          <w:rtl/>
-        </w:rPr>
-        <w:t>الهاتف</w:t>
-      </w:r>
-      <w:r>
-        <w:rPr>
-          <w:rStyle w:val="Strong"/>
-          <w:sz w:val="24"/>
-          <w:szCs w:val="24"/>
-          <w:rtl/>
-        </w:rPr>
-        <w:t>: [</w:t>
-      </w:r>
-      <w:r>
-        <w:rPr>
-          <w:rStyle w:val="Strong"/>
-          <w:rFonts w:ascii="Arial" w:hAnsi="Arial" w:cs="Arial" w:hint="cs"/>
-          <w:sz w:val="24"/>
-          <w:szCs w:val="24"/>
-          <w:rtl/>
-        </w:rPr>
-        <w:t>رقم</w:t>
-      </w:r>
-      <w:r>
-        <w:rPr>
-          <w:rStyle w:val="Strong"/>
-          <w:sz w:val="24"/>
-          <w:szCs w:val="24"/>
-          <w:rtl/>
-        </w:rPr>
-        <w:t xml:space="preserve"> </w:t>
-      </w:r>
-      <w:r>
-        <w:rPr>
-          <w:rStyle w:val="Strong"/>
-          <w:rFonts w:ascii="Arial" w:hAnsi="Arial" w:cs="Arial" w:hint="cs"/>
-          <w:sz w:val="24"/>
-          <w:szCs w:val="24"/>
-          <w:rtl/>
-        </w:rPr>
-        <w:t>الهاتف</w:t>
-      </w:r>
-      <w:r>
-        <w:rPr>
-          <w:rStyle w:val="Strong"/>
-          <w:sz w:val="24"/>
-          <w:szCs w:val="24"/>
-          <w:rtl/>
-        </w:rPr>
-        <w:t>]</w:t>
-      </w:r>
-      <w:r>
-        <w:rPr>
-          <w:rStyle w:val="Strong"/>
-          <w:sz w:val="24"/>
-          <w:szCs w:val="24"/>
-        </w:rPr>
-        <w:t xml:space="preserve"> </w:t>
-      </w:r>
+        <w:t xml:space="preserve"> ___________________</w:t>
+      </w:r>
+      <w:bookmarkStart w:id="0" w:name="_GoBack"/>
+      <w:bookmarkEnd w:id="0"/>
     </w:p>
     <w:sectPr>
       <w:pgSz w:w="11910" w:h="16845"/>
       <w:pgMar w:top="720" w:right="720" w:bottom="720" w:left="720" w:header="720" w:footer="720" w:gutter="0"/>
+      <w:pgBorders w:offsetFrom="page">
+        <w:top w:val="single" w:sz="4" w:space="24" w:color="auto" w:shadow="1"/>
+        <w:left w:val="single" w:sz="4" w:space="24" w:color="auto" w:shadow="1"/>
+        <w:bottom w:val="single" w:sz="4" w:space="24" w:color="auto" w:shadow="1"/>
+        <w:right w:val="single" w:sz="4" w:space="24" w:color="auto" w:shadow="1"/>
+      </w:pgBorders>
       <w:cols w:space="720"/>
       <w:docGrid w:linePitch="299"/>
     </w:sectPr>
@@ -3520,7 +3615,7 @@
   <w:abstractNum w:abstractNumId="0">
     <w:nsid w:val="01B53939"/>
     <w:multiLevelType w:val="hybridMultilevel"/>
-    <w:tmpl w:val="16A86D9C"/>
+    <w:tmpl w:val="863E659C"/>
     <w:lvl w:ilvl="0" w:tplc="0409000D">
       <w:start w:val="1"/>
       <w:numFmt w:val="bullet"/>
@@ -3713,6 +3808,181 @@
     </w:lvl>
   </w:abstractNum>
   <w:abstractNum w:abstractNumId="2">
+    <w:nsid w:val="13CA52B9"/>
+    <w:multiLevelType w:val="hybridMultilevel"/>
+    <w:tmpl w:val="A91AD09C"/>
+    <w:lvl w:ilvl="0" w:tplc="04090001">
+      <w:start w:val="1"/>
+      <w:numFmt w:val="bullet"/>
+      <w:lvlText w:val=""/>
+      <w:lvlJc w:val="left"/>
+      <w:pPr>
+        <w:ind w:left="760" w:hanging="360"/>
+      </w:pPr>
+      <w:rPr>
+        <w:rFonts w:ascii="Symbol" w:hAnsi="Symbol" w:hint="default"/>
+      </w:rPr>
+    </w:lvl>
+    <w:lvl w:ilvl="1" w:tplc="04090019" w:tentative="1">
+      <w:start w:val="1"/>
+      <w:numFmt w:val="lowerLetter"/>
+      <w:lvlText w:val="%2."/>
+      <w:lvlJc w:val="left"/>
+      <w:pPr>
+        <w:ind w:left="1480" w:hanging="360"/>
+      </w:pPr>
+    </w:lvl>
+    <w:lvl w:ilvl="2" w:tplc="0409001B" w:tentative="1">
+      <w:start w:val="1"/>
+      <w:numFmt w:val="lowerRoman"/>
+      <w:lvlText w:val="%3."/>
+      <w:lvlJc w:val="right"/>
+      <w:pPr>
+        <w:ind w:left="2200" w:hanging="180"/>
+      </w:pPr>
+    </w:lvl>
+    <w:lvl w:ilvl="3" w:tplc="0409000F" w:tentative="1">
+      <w:start w:val="1"/>
+      <w:numFmt w:val="decimal"/>
+      <w:lvlText w:val="%4."/>
+      <w:lvlJc w:val="left"/>
+      <w:pPr>
+        <w:ind w:left="2920" w:hanging="360"/>
+      </w:pPr>
+    </w:lvl>
+    <w:lvl w:ilvl="4" w:tplc="04090019" w:tentative="1">
+      <w:start w:val="1"/>
+      <w:numFmt w:val="lowerLetter"/>
+      <w:lvlText w:val="%5."/>
+      <w:lvlJc w:val="left"/>
+      <w:pPr>
+        <w:ind w:left="3640" w:hanging="360"/>
+      </w:pPr>
+    </w:lvl>
+    <w:lvl w:ilvl="5" w:tplc="0409001B" w:tentative="1">
+      <w:start w:val="1"/>
+      <w:numFmt w:val="lowerRoman"/>
+      <w:lvlText w:val="%6."/>
+      <w:lvlJc w:val="right"/>
+      <w:pPr>
+        <w:ind w:left="4360" w:hanging="180"/>
+      </w:pPr>
+    </w:lvl>
+    <w:lvl w:ilvl="6" w:tplc="0409000F" w:tentative="1">
+      <w:start w:val="1"/>
+      <w:numFmt w:val="decimal"/>
+      <w:lvlText w:val="%7."/>
+      <w:lvlJc w:val="left"/>
+      <w:pPr>
+        <w:ind w:left="5080" w:hanging="360"/>
+      </w:pPr>
+    </w:lvl>
+    <w:lvl w:ilvl="7" w:tplc="04090019" w:tentative="1">
+      <w:start w:val="1"/>
+      <w:numFmt w:val="lowerLetter"/>
+      <w:lvlText w:val="%8."/>
+      <w:lvlJc w:val="left"/>
+      <w:pPr>
+        <w:ind w:left="5800" w:hanging="360"/>
+      </w:pPr>
+    </w:lvl>
+    <w:lvl w:ilvl="8" w:tplc="0409001B" w:tentative="1">
+      <w:start w:val="1"/>
+      <w:numFmt w:val="lowerRoman"/>
+      <w:lvlText w:val="%9."/>
+      <w:lvlJc w:val="right"/>
+      <w:pPr>
+        <w:ind w:left="6520" w:hanging="180"/>
+      </w:pPr>
+    </w:lvl>
+  </w:abstractNum>
+  <w:abstractNum w:abstractNumId="3">
+    <w:nsid w:val="1EE903BB"/>
+    <w:multiLevelType w:val="hybridMultilevel"/>
+    <w:tmpl w:val="AB545370"/>
+    <w:lvl w:ilvl="0" w:tplc="0409000F">
+      <w:start w:val="1"/>
+      <w:numFmt w:val="decimal"/>
+      <w:lvlText w:val="%1."/>
+      <w:lvlJc w:val="left"/>
+      <w:pPr>
+        <w:ind w:left="760" w:hanging="360"/>
+      </w:pPr>
+    </w:lvl>
+    <w:lvl w:ilvl="1" w:tplc="04090019" w:tentative="1">
+      <w:start w:val="1"/>
+      <w:numFmt w:val="lowerLetter"/>
+      <w:lvlText w:val="%2."/>
+      <w:lvlJc w:val="left"/>
+      <w:pPr>
+        <w:ind w:left="1480" w:hanging="360"/>
+      </w:pPr>
+    </w:lvl>
+    <w:lvl w:ilvl="2" w:tplc="0409001B" w:tentative="1">
+      <w:start w:val="1"/>
+      <w:numFmt w:val="lowerRoman"/>
+      <w:lvlText w:val="%3."/>
+      <w:lvlJc w:val="right"/>
+      <w:pPr>
+        <w:ind w:left="2200" w:hanging="180"/>
+      </w:pPr>
+    </w:lvl>
+    <w:lvl w:ilvl="3" w:tplc="0409000F" w:tentative="1">
+      <w:start w:val="1"/>
+      <w:numFmt w:val="decimal"/>
+      <w:lvlText w:val="%4."/>
+      <w:lvlJc w:val="left"/>
+      <w:pPr>
+        <w:ind w:left="2920" w:hanging="360"/>
+      </w:pPr>
+    </w:lvl>
+    <w:lvl w:ilvl="4" w:tplc="04090019" w:tentative="1">
+      <w:start w:val="1"/>
+      <w:numFmt w:val="lowerLetter"/>
+      <w:lvlText w:val="%5."/>
+      <w:lvlJc w:val="left"/>
+      <w:pPr>
+        <w:ind w:left="3640" w:hanging="360"/>
+      </w:pPr>
+    </w:lvl>
+    <w:lvl w:ilvl="5" w:tplc="0409001B" w:tentative="1">
+      <w:start w:val="1"/>
+      <w:numFmt w:val="lowerRoman"/>
+      <w:lvlText w:val="%6."/>
+      <w:lvlJc w:val="right"/>
+      <w:pPr>
+        <w:ind w:left="4360" w:hanging="180"/>
+      </w:pPr>
+    </w:lvl>
+    <w:lvl w:ilvl="6" w:tplc="0409000F" w:tentative="1">
+      <w:start w:val="1"/>
+      <w:numFmt w:val="decimal"/>
+      <w:lvlText w:val="%7."/>
+      <w:lvlJc w:val="left"/>
+      <w:pPr>
+        <w:ind w:left="5080" w:hanging="360"/>
+      </w:pPr>
+    </w:lvl>
+    <w:lvl w:ilvl="7" w:tplc="04090019" w:tentative="1">
+      <w:start w:val="1"/>
+      <w:numFmt w:val="lowerLetter"/>
+      <w:lvlText w:val="%8."/>
+      <w:lvlJc w:val="left"/>
+      <w:pPr>
+        <w:ind w:left="5800" w:hanging="360"/>
+      </w:pPr>
+    </w:lvl>
+    <w:lvl w:ilvl="8" w:tplc="0409001B" w:tentative="1">
+      <w:start w:val="1"/>
+      <w:numFmt w:val="lowerRoman"/>
+      <w:lvlText w:val="%9."/>
+      <w:lvlJc w:val="right"/>
+      <w:pPr>
+        <w:ind w:left="6520" w:hanging="180"/>
+      </w:pPr>
+    </w:lvl>
+  </w:abstractNum>
+  <w:abstractNum w:abstractNumId="4">
     <w:nsid w:val="34B00348"/>
     <w:multiLevelType w:val="hybridMultilevel"/>
     <w:tmpl w:val="2604CCB0"/>
@@ -3818,7 +4088,7 @@
       <w:lvlJc w:val="left"/>
     </w:lvl>
   </w:abstractNum>
-  <w:abstractNum w:abstractNumId="3">
+  <w:abstractNum w:abstractNumId="5">
     <w:nsid w:val="484E2561"/>
     <w:multiLevelType w:val="hybridMultilevel"/>
     <w:tmpl w:val="76F40CD2"/>
@@ -3924,7 +4194,7 @@
       <w:lvlJc w:val="left"/>
     </w:lvl>
   </w:abstractNum>
-  <w:abstractNum w:abstractNumId="4">
+  <w:abstractNum w:abstractNumId="6">
     <w:nsid w:val="4989577F"/>
     <w:multiLevelType w:val="hybridMultilevel"/>
     <w:tmpl w:val="A2808D16"/>
@@ -4027,7 +4297,7 @@
       <w:lvlJc w:val="left"/>
     </w:lvl>
   </w:abstractNum>
-  <w:abstractNum w:abstractNumId="5">
+  <w:abstractNum w:abstractNumId="7">
     <w:nsid w:val="4A7937AF"/>
     <w:multiLevelType w:val="hybridMultilevel"/>
     <w:tmpl w:val="CF081C8C"/>
@@ -4133,7 +4403,7 @@
       <w:lvlJc w:val="left"/>
     </w:lvl>
   </w:abstractNum>
-  <w:abstractNum w:abstractNumId="6">
+  <w:abstractNum w:abstractNumId="8">
     <w:nsid w:val="4C3B3F4E"/>
     <w:multiLevelType w:val="hybridMultilevel"/>
     <w:tmpl w:val="9530E6D6"/>
@@ -4239,7 +4509,7 @@
       <w:lvlJc w:val="left"/>
     </w:lvl>
   </w:abstractNum>
-  <w:abstractNum w:abstractNumId="7">
+  <w:abstractNum w:abstractNumId="9">
     <w:nsid w:val="5B982768"/>
     <w:multiLevelType w:val="hybridMultilevel"/>
     <w:tmpl w:val="FA3A1CA0"/>
@@ -4345,7 +4615,7 @@
       <w:lvlJc w:val="left"/>
     </w:lvl>
   </w:abstractNum>
-  <w:abstractNum w:abstractNumId="8">
+  <w:abstractNum w:abstractNumId="10">
     <w:nsid w:val="5D596E91"/>
     <w:multiLevelType w:val="hybridMultilevel"/>
     <w:tmpl w:val="0C48A250"/>
@@ -4451,7 +4721,120 @@
       <w:lvlJc w:val="left"/>
     </w:lvl>
   </w:abstractNum>
-  <w:abstractNum w:abstractNumId="9">
+  <w:abstractNum w:abstractNumId="11">
+    <w:nsid w:val="69CC05C9"/>
+    <w:multiLevelType w:val="hybridMultilevel"/>
+    <w:tmpl w:val="41F6D6AA"/>
+    <w:lvl w:ilvl="0" w:tplc="04090001">
+      <w:start w:val="1"/>
+      <w:numFmt w:val="bullet"/>
+      <w:lvlText w:val=""/>
+      <w:lvlJc w:val="left"/>
+      <w:pPr>
+        <w:ind w:left="760" w:hanging="360"/>
+      </w:pPr>
+      <w:rPr>
+        <w:rFonts w:ascii="Symbol" w:hAnsi="Symbol" w:hint="default"/>
+      </w:rPr>
+    </w:lvl>
+    <w:lvl w:ilvl="1" w:tplc="04090003" w:tentative="1">
+      <w:start w:val="1"/>
+      <w:numFmt w:val="bullet"/>
+      <w:lvlText w:val="o"/>
+      <w:lvlJc w:val="left"/>
+      <w:pPr>
+        <w:ind w:left="1480" w:hanging="360"/>
+      </w:pPr>
+      <w:rPr>
+        <w:rFonts w:ascii="Courier New" w:hAnsi="Courier New" w:cs="Courier New" w:hint="default"/>
+      </w:rPr>
+    </w:lvl>
+    <w:lvl w:ilvl="2" w:tplc="04090005" w:tentative="1">
+      <w:start w:val="1"/>
+      <w:numFmt w:val="bullet"/>
+      <w:lvlText w:val=""/>
+      <w:lvlJc w:val="left"/>
+      <w:pPr>
+        <w:ind w:left="2200" w:hanging="360"/>
+      </w:pPr>
+      <w:rPr>
+        <w:rFonts w:ascii="Wingdings" w:hAnsi="Wingdings" w:hint="default"/>
+      </w:rPr>
+    </w:lvl>
+    <w:lvl w:ilvl="3" w:tplc="04090001" w:tentative="1">
+      <w:start w:val="1"/>
+      <w:numFmt w:val="bullet"/>
+      <w:lvlText w:val=""/>
+      <w:lvlJc w:val="left"/>
+      <w:pPr>
+        <w:ind w:left="2920" w:hanging="360"/>
+      </w:pPr>
+      <w:rPr>
+        <w:rFonts w:ascii="Symbol" w:hAnsi="Symbol" w:hint="default"/>
+      </w:rPr>
+    </w:lvl>
+    <w:lvl w:ilvl="4" w:tplc="04090003" w:tentative="1">
+      <w:start w:val="1"/>
+      <w:numFmt w:val="bullet"/>
+      <w:lvlText w:val="o"/>
+      <w:lvlJc w:val="left"/>
+      <w:pPr>
+        <w:ind w:left="3640" w:hanging="360"/>
+      </w:pPr>
+      <w:rPr>
+        <w:rFonts w:ascii="Courier New" w:hAnsi="Courier New" w:cs="Courier New" w:hint="default"/>
+      </w:rPr>
+    </w:lvl>
+    <w:lvl w:ilvl="5" w:tplc="04090005" w:tentative="1">
+      <w:start w:val="1"/>
+      <w:numFmt w:val="bullet"/>
+      <w:lvlText w:val=""/>
+      <w:lvlJc w:val="left"/>
+      <w:pPr>
+        <w:ind w:left="4360" w:hanging="360"/>
+      </w:pPr>
+      <w:rPr>
+        <w:rFonts w:ascii="Wingdings" w:hAnsi="Wingdings" w:hint="default"/>
+      </w:rPr>
+    </w:lvl>
+    <w:lvl w:ilvl="6" w:tplc="04090001" w:tentative="1">
+      <w:start w:val="1"/>
+      <w:numFmt w:val="bullet"/>
+      <w:lvlText w:val=""/>
+      <w:lvlJc w:val="left"/>
+      <w:pPr>
+        <w:ind w:left="5080" w:hanging="360"/>
+      </w:pPr>
+      <w:rPr>
+        <w:rFonts w:ascii="Symbol" w:hAnsi="Symbol" w:hint="default"/>
+      </w:rPr>
+    </w:lvl>
+    <w:lvl w:ilvl="7" w:tplc="04090003" w:tentative="1">
+      <w:start w:val="1"/>
+      <w:numFmt w:val="bullet"/>
+      <w:lvlText w:val="o"/>
+      <w:lvlJc w:val="left"/>
+      <w:pPr>
+        <w:ind w:left="5800" w:hanging="360"/>
+      </w:pPr>
+      <w:rPr>
+        <w:rFonts w:ascii="Courier New" w:hAnsi="Courier New" w:cs="Courier New" w:hint="default"/>
+      </w:rPr>
+    </w:lvl>
+    <w:lvl w:ilvl="8" w:tplc="04090005" w:tentative="1">
+      <w:start w:val="1"/>
+      <w:numFmt w:val="bullet"/>
+      <w:lvlText w:val=""/>
+      <w:lvlJc w:val="left"/>
+      <w:pPr>
+        <w:ind w:left="6520" w:hanging="360"/>
+      </w:pPr>
+      <w:rPr>
+        <w:rFonts w:ascii="Wingdings" w:hAnsi="Wingdings" w:hint="default"/>
+      </w:rPr>
+    </w:lvl>
+  </w:abstractNum>
+  <w:abstractNum w:abstractNumId="12">
     <w:nsid w:val="6A8A781C"/>
     <w:multiLevelType w:val="hybridMultilevel"/>
     <w:tmpl w:val="18084CC2"/>
@@ -4557,7 +4940,7 @@
       <w:lvlJc w:val="left"/>
     </w:lvl>
   </w:abstractNum>
-  <w:abstractNum w:abstractNumId="10">
+  <w:abstractNum w:abstractNumId="13">
     <w:nsid w:val="6E550F2B"/>
     <w:multiLevelType w:val="hybridMultilevel"/>
     <w:tmpl w:val="3FAE87D0"/>
@@ -4663,7 +5046,7 @@
       <w:lvlJc w:val="left"/>
     </w:lvl>
   </w:abstractNum>
-  <w:abstractNum w:abstractNumId="11">
+  <w:abstractNum w:abstractNumId="14">
     <w:nsid w:val="74D30D0E"/>
     <w:multiLevelType w:val="hybridMultilevel"/>
     <w:tmpl w:val="145A038A"/>
@@ -4770,40 +5153,49 @@
     </w:lvl>
   </w:abstractNum>
   <w:num w:numId="1">
+    <w:abstractNumId w:val="6"/>
+  </w:num>
+  <w:num w:numId="2">
     <w:abstractNumId w:val="4"/>
   </w:num>
-  <w:num w:numId="2">
-    <w:abstractNumId w:val="2"/>
-  </w:num>
   <w:num w:numId="3">
-    <w:abstractNumId w:val="5"/>
+    <w:abstractNumId w:val="7"/>
   </w:num>
   <w:num w:numId="4">
-    <w:abstractNumId w:val="6"/>
+    <w:abstractNumId w:val="8"/>
   </w:num>
   <w:num w:numId="5">
-    <w:abstractNumId w:val="7"/>
+    <w:abstractNumId w:val="9"/>
   </w:num>
   <w:num w:numId="6">
+    <w:abstractNumId w:val="13"/>
+  </w:num>
+  <w:num w:numId="7">
     <w:abstractNumId w:val="10"/>
   </w:num>
-  <w:num w:numId="7">
-    <w:abstractNumId w:val="8"/>
-  </w:num>
   <w:num w:numId="8">
-    <w:abstractNumId w:val="11"/>
+    <w:abstractNumId w:val="14"/>
   </w:num>
   <w:num w:numId="9">
-    <w:abstractNumId w:val="9"/>
+    <w:abstractNumId w:val="12"/>
   </w:num>
   <w:num w:numId="10">
     <w:abstractNumId w:val="1"/>
   </w:num>
   <w:num w:numId="11">
-    <w:abstractNumId w:val="3"/>
+    <w:abstractNumId w:val="5"/>
   </w:num>
   <w:num w:numId="12">
     <w:abstractNumId w:val="0"/>
+  </w:num>
+  <w:num w:numId="13">
+    <w:abstractNumId w:val="11"/>
+  </w:num>
+  <w:num w:numId="14">
+    <w:abstractNumId w:val="3"/>
+  </w:num>
+  <w:num w:numId="15">
+    <w:abstractNumId w:val="2"/>
   </w:num>
 </w:numbering>
 </file>
@@ -4971,7 +5363,6 @@
   <w:style w:type="character" w:default="1" w:styleId="DefaultParagraphFont">
     <w:name w:val="Default Paragraph Font"/>
     <w:uiPriority w:val="1"/>
-    <w:semiHidden/>
     <w:unhideWhenUsed/>
   </w:style>
   <w:style w:type="table" w:default="1" w:styleId="TableNormal">
@@ -5591,7 +5982,7 @@
 </file>
 
 <file path=customXml/itemProps1.xml><?xml version="1.0" encoding="utf-8"?>
-<ds:datastoreItem xmlns:ds="http://schemas.openxmlformats.org/officeDocument/2006/customXml" ds:itemID="{EB81A013-A8D2-4F93-9211-CBBED81F38C2}">
+<ds:datastoreItem xmlns:ds="http://schemas.openxmlformats.org/officeDocument/2006/customXml" ds:itemID="{54972831-EAAC-43D9-97E0-B2EFEFBA2A93}">
   <ds:schemaRefs>
     <ds:schemaRef ds:uri="http://schemas.openxmlformats.org/officeDocument/2006/bibliography"/>
   </ds:schemaRefs>

</xml_diff>